<commit_message>
Actualizar archivos docx en public/exports
</commit_message>
<xml_diff>
--- a/public/exports/Bitacora_EAAB.docx
+++ b/public/exports/Bitacora_EAAB.docx
@@ -4,24 +4,53 @@
   <w:body>
     <w:p>
       <w:pPr>
-        <w:spacing w:after="100" w:before="100"/>
+        <w:spacing w:after="200" w:before="100"/>
         <w:jc w:val="center"/>
       </w:pPr>
       <w:r>
-        <w:rPr>
-          <w:rFonts w:ascii="Calibri" w:cs="Calibri" w:eastAsia="Calibri" w:hAnsi="Calibri"/>
-          <w:b/>
-          <w:bCs/>
-          <w:color w:val="0F4C81"/>
-          <w:sz w:val="24"/>
-          <w:szCs w:val="24"/>
-        </w:rPr>
-        <w:t xml:space="preserve">CORPORACION UNIVERSITARIA LATINOAMERICANA (CUL)</w:t>
-      </w:r>
-    </w:p>
-    <w:p>
-      <w:pPr>
-        <w:spacing w:after="80" w:before="160"/>
+        <w:drawing>
+          <wp:inline distT="0" distB="0" distL="0" distR="0">
+            <wp:extent cx="1381125" cy="1428750"/>
+            <wp:effectExtent t="0" r="0" b="0" l="0"/>
+            <wp:docPr id="1" name="" descr="" title=""/>
+            <wp:cNvGraphicFramePr>
+              <a:graphicFrameLocks xmlns:a="http://schemas.openxmlformats.org/drawingml/2006/main" noChangeAspect="1"/>
+            </wp:cNvGraphicFramePr>
+            <a:graphic xmlns:a="http://schemas.openxmlformats.org/drawingml/2006/main">
+              <a:graphicData uri="http://schemas.openxmlformats.org/drawingml/2006/picture">
+                <pic:pic xmlns:pic="http://schemas.openxmlformats.org/drawingml/2006/picture">
+                  <pic:nvPicPr>
+                    <pic:cNvPr id="0" name="" descr=""/>
+                    <pic:cNvPicPr>
+                      <a:picLocks noChangeAspect="1" noChangeArrowheads="1"/>
+                    </pic:cNvPicPr>
+                  </pic:nvPicPr>
+                  <pic:blipFill>
+                    <a:blip r:embed="rId9" cstate="none"/>
+                    <a:srcRect/>
+                    <a:stretch>
+                      <a:fillRect/>
+                    </a:stretch>
+                  </pic:blipFill>
+                  <pic:spPr bwMode="auto">
+                    <a:xfrm>
+                      <a:off x="0" y="0"/>
+                      <a:ext cx="1381125" cy="1428750"/>
+                    </a:xfrm>
+                    <a:prstGeom prst="rect">
+                      <a:avLst/>
+                    </a:prstGeom>
+                  </pic:spPr>
+                </pic:pic>
+              </a:graphicData>
+            </a:graphic>
+          </wp:inline>
+        </w:drawing>
+      </w:r>
+    </w:p>
+    <w:p>
+      <w:pPr>
+        <w:spacing w:after="400" w:before="100"/>
         <w:jc w:val="center"/>
       </w:pPr>
       <w:r>
@@ -30,15 +59,15 @@
           <w:b/>
           <w:bCs/>
           <w:color w:val="1E293B"/>
-          <w:sz w:val="32"/>
-          <w:szCs w:val="32"/>
-        </w:rPr>
-        <w:t xml:space="preserve">BITÁCORA DE INVESTIGACIÓN Y AUDITORÍA DE SISTEMAS</w:t>
-      </w:r>
-    </w:p>
-    <w:p>
-      <w:pPr>
-        <w:spacing w:after="320"/>
+          <w:sz w:val="26"/>
+          <w:szCs w:val="26"/>
+        </w:rPr>
+        <w:t xml:space="preserve">Bitácora Empresa de Acueducto y Alcantarillado de Bogotá E.S.P. (EAAB-ESP)</w:t>
+      </w:r>
+    </w:p>
+    <w:p>
+      <w:pPr>
+        <w:spacing w:after="80"/>
         <w:jc w:val="center"/>
       </w:pPr>
       <w:r>
@@ -46,11 +75,197 @@
           <w:rFonts w:ascii="Calibri" w:cs="Calibri" w:eastAsia="Calibri" w:hAnsi="Calibri"/>
           <w:b/>
           <w:bCs/>
-          <w:color w:val="0F4C81"/>
-          <w:sz w:val="24"/>
-          <w:szCs w:val="24"/>
-        </w:rPr>
-        <w:t xml:space="preserve">Empresa de Acueducto y Alcantarillado de Bogotá E.S.P. (EAAB-ESP)</w:t>
+          <w:color w:val="1E293B"/>
+          <w:sz w:val="22"/>
+          <w:szCs w:val="22"/>
+        </w:rPr>
+        <w:t xml:space="preserve">BERNAL OSORIO ANDRES</w:t>
+      </w:r>
+    </w:p>
+    <w:p>
+      <w:pPr>
+        <w:spacing w:after="80"/>
+        <w:jc w:val="center"/>
+      </w:pPr>
+      <w:r>
+        <w:rPr>
+          <w:rFonts w:ascii="Calibri" w:cs="Calibri" w:eastAsia="Calibri" w:hAnsi="Calibri"/>
+          <w:b/>
+          <w:bCs/>
+          <w:color w:val="1E293B"/>
+          <w:sz w:val="22"/>
+          <w:szCs w:val="22"/>
+        </w:rPr>
+        <w:t xml:space="preserve">VIZCAINO ESCAMILLA MARIA</w:t>
+      </w:r>
+    </w:p>
+    <w:p>
+      <w:pPr>
+        <w:spacing w:after="80"/>
+        <w:jc w:val="center"/>
+      </w:pPr>
+      <w:r>
+        <w:rPr>
+          <w:rFonts w:ascii="Calibri" w:cs="Calibri" w:eastAsia="Calibri" w:hAnsi="Calibri"/>
+          <w:b/>
+          <w:bCs/>
+          <w:color w:val="1E293B"/>
+          <w:sz w:val="22"/>
+          <w:szCs w:val="22"/>
+        </w:rPr>
+        <w:t xml:space="preserve">MERCADO EGUIS SHADIA</w:t>
+      </w:r>
+    </w:p>
+    <w:p>
+      <w:pPr>
+        <w:spacing w:after="60" w:before="300"/>
+        <w:jc w:val="center"/>
+      </w:pPr>
+      <w:r>
+        <w:rPr>
+          <w:rFonts w:ascii="Calibri" w:cs="Calibri" w:eastAsia="Calibri" w:hAnsi="Calibri"/>
+          <w:b/>
+          <w:bCs/>
+          <w:color w:val="1E293B"/>
+          <w:sz w:val="20"/>
+          <w:szCs w:val="20"/>
+        </w:rPr>
+        <w:t xml:space="preserve">DOCENTE</w:t>
+      </w:r>
+    </w:p>
+    <w:p>
+      <w:pPr>
+        <w:spacing w:after="250"/>
+        <w:jc w:val="center"/>
+      </w:pPr>
+      <w:r>
+        <w:rPr>
+          <w:rFonts w:ascii="Calibri" w:cs="Calibri" w:eastAsia="Calibri" w:hAnsi="Calibri"/>
+          <w:b/>
+          <w:bCs/>
+          <w:color w:val="1E293B"/>
+          <w:sz w:val="22"/>
+          <w:szCs w:val="22"/>
+        </w:rPr>
+        <w:t xml:space="preserve">RUIZ BOTERO WILMER</w:t>
+      </w:r>
+    </w:p>
+    <w:p>
+      <w:pPr>
+        <w:spacing w:after="60" w:before="100"/>
+        <w:jc w:val="center"/>
+      </w:pPr>
+      <w:r>
+        <w:rPr>
+          <w:rFonts w:ascii="Calibri" w:cs="Calibri" w:eastAsia="Calibri" w:hAnsi="Calibri"/>
+          <w:b/>
+          <w:bCs/>
+          <w:color w:val="1E293B"/>
+          <w:sz w:val="20"/>
+          <w:szCs w:val="20"/>
+        </w:rPr>
+        <w:t xml:space="preserve">ASIGNATURA</w:t>
+      </w:r>
+    </w:p>
+    <w:p>
+      <w:pPr>
+        <w:spacing w:after="300"/>
+        <w:jc w:val="center"/>
+      </w:pPr>
+      <w:r>
+        <w:rPr>
+          <w:rFonts w:ascii="Calibri" w:cs="Calibri" w:eastAsia="Calibri" w:hAnsi="Calibri"/>
+          <w:b/>
+          <w:bCs/>
+          <w:color w:val="1E293B"/>
+          <w:sz w:val="22"/>
+          <w:szCs w:val="22"/>
+        </w:rPr>
+        <w:t xml:space="preserve">ZCPVIIIA AUDITORIA DE SISTEMA</w:t>
+      </w:r>
+    </w:p>
+    <w:p>
+      <w:pPr>
+        <w:spacing w:after="50"/>
+        <w:jc w:val="center"/>
+      </w:pPr>
+      <w:r>
+        <w:rPr>
+          <w:rFonts w:ascii="Calibri" w:cs="Calibri" w:eastAsia="Calibri" w:hAnsi="Calibri"/>
+          <w:b/>
+          <w:bCs/>
+          <w:color w:val="1E293B"/>
+          <w:sz w:val="22"/>
+          <w:szCs w:val="22"/>
+        </w:rPr>
+        <w:t xml:space="preserve">Corporación Universitaria Latinoamericana</w:t>
+      </w:r>
+    </w:p>
+    <w:p>
+      <w:pPr>
+        <w:spacing w:after="50"/>
+        <w:jc w:val="center"/>
+      </w:pPr>
+      <w:r>
+        <w:rPr>
+          <w:rFonts w:ascii="Calibri" w:cs="Calibri" w:eastAsia="Calibri" w:hAnsi="Calibri"/>
+          <w:color w:val="1E293B"/>
+          <w:sz w:val="22"/>
+          <w:szCs w:val="22"/>
+        </w:rPr>
+        <w:t xml:space="preserve">Contaduría Publica</w:t>
+      </w:r>
+    </w:p>
+    <w:p>
+      <w:pPr>
+        <w:spacing w:after="50"/>
+        <w:jc w:val="center"/>
+      </w:pPr>
+      <w:r>
+        <w:rPr>
+          <w:rFonts w:ascii="Calibri" w:cs="Calibri" w:eastAsia="Calibri" w:hAnsi="Calibri"/>
+          <w:color w:val="1E293B"/>
+          <w:sz w:val="22"/>
+          <w:szCs w:val="22"/>
+        </w:rPr>
+        <w:t xml:space="preserve">Barranquilla/Atlántico</w:t>
+      </w:r>
+    </w:p>
+    <w:p>
+      <w:pPr>
+        <w:spacing w:after="50"/>
+        <w:jc w:val="center"/>
+      </w:pPr>
+      <w:r>
+        <w:rPr>
+          <w:rFonts w:ascii="Calibri" w:cs="Calibri" w:eastAsia="Calibri" w:hAnsi="Calibri"/>
+          <w:color w:val="1E293B"/>
+          <w:sz w:val="22"/>
+          <w:szCs w:val="22"/>
+        </w:rPr>
+        <w:t xml:space="preserve">Colombia</w:t>
+      </w:r>
+    </w:p>
+    <w:p>
+      <w:pPr>
+        <w:spacing w:after="150"/>
+        <w:jc w:val="center"/>
+      </w:pPr>
+      <w:r>
+        <w:rPr>
+          <w:rFonts w:ascii="Calibri" w:cs="Calibri" w:eastAsia="Calibri" w:hAnsi="Calibri"/>
+          <w:b/>
+          <w:bCs/>
+          <w:color w:val="1E293B"/>
+          <w:sz w:val="22"/>
+          <w:szCs w:val="22"/>
+        </w:rPr>
+        <w:t xml:space="preserve">2026</w:t>
+      </w:r>
+    </w:p>
+    <w:p>
+      <w:r>
+        <w:br w:type="page"/>
       </w:r>
     </w:p>
     <w:p>
@@ -187,7 +402,76 @@
                 <w:sz w:val="20"/>
                 <w:szCs w:val="20"/>
               </w:rPr>
-              <w:t xml:space="preserve">NIT / Identificación</w:t>
+              <w:t xml:space="preserve">Sigla / Nombre Comercial</w:t>
+            </w:r>
+          </w:p>
+        </w:tc>
+        <w:tc>
+          <w:tcPr>
+            <w:tcW w:type="dxa" w:w="6720"/>
+            <w:tcBorders>
+              <w:top w:val="single" w:color="CBD5E1" w:sz="4"/>
+              <w:left w:val="single" w:color="CBD5E1" w:sz="4"/>
+              <w:bottom w:val="single" w:color="CBD5E1" w:sz="4"/>
+              <w:right w:val="single" w:color="CBD5E1" w:sz="4"/>
+            </w:tcBorders>
+            <w:tcMar>
+              <w:top w:type="dxa" w:w="90"/>
+              <w:left w:type="dxa" w:w="140"/>
+              <w:bottom w:type="dxa" w:w="90"/>
+              <w:right w:type="dxa" w:w="140"/>
+            </w:tcMar>
+          </w:tcPr>
+          <w:p>
+            <w:pPr>
+              <w:spacing w:after="0" w:line="276"/>
+              <w:jc w:val="left"/>
+            </w:pPr>
+            <w:r>
+              <w:rPr>
+                <w:rFonts w:ascii="Calibri" w:cs="Calibri" w:eastAsia="Calibri" w:hAnsi="Calibri"/>
+                <w:color w:val="1E293B"/>
+                <w:sz w:val="20"/>
+                <w:szCs w:val="20"/>
+              </w:rPr>
+              <w:t xml:space="preserve">EAAB-ESP</w:t>
+            </w:r>
+          </w:p>
+        </w:tc>
+      </w:tr>
+      <w:tr>
+        <w:tc>
+          <w:tcPr>
+            <w:tcW w:type="dxa" w:w="2600"/>
+            <w:tcBorders>
+              <w:top w:val="single" w:color="CBD5E1" w:sz="4"/>
+              <w:left w:val="single" w:color="CBD5E1" w:sz="4"/>
+              <w:bottom w:val="single" w:color="CBD5E1" w:sz="4"/>
+              <w:right w:val="single" w:color="CBD5E1" w:sz="4"/>
+            </w:tcBorders>
+            <w:shd w:fill="F1F5F9" w:val="clear"/>
+            <w:tcMar>
+              <w:top w:type="dxa" w:w="90"/>
+              <w:left w:type="dxa" w:w="140"/>
+              <w:bottom w:type="dxa" w:w="90"/>
+              <w:right w:type="dxa" w:w="140"/>
+            </w:tcMar>
+          </w:tcPr>
+          <w:p>
+            <w:pPr>
+              <w:spacing w:after="0" w:line="276"/>
+              <w:jc w:val="left"/>
+            </w:pPr>
+            <w:r>
+              <w:rPr>
+                <w:rFonts w:ascii="Calibri" w:cs="Calibri" w:eastAsia="Calibri" w:hAnsi="Calibri"/>
+                <w:b/>
+                <w:bCs/>
+                <w:color w:val="0F4C81"/>
+                <w:sz w:val="20"/>
+                <w:szCs w:val="20"/>
+              </w:rPr>
+              <w:t xml:space="preserve">NIT / Identificación Tributaria</w:t>
             </w:r>
           </w:p>
         </w:tc>
@@ -256,7 +540,7 @@
                 <w:sz w:val="20"/>
                 <w:szCs w:val="20"/>
               </w:rPr>
-              <w:t xml:space="preserve">Domicilio Principal</w:t>
+              <w:t xml:space="preserve">Domicilio Principal / Sede</w:t>
             </w:r>
           </w:p>
         </w:tc>
@@ -357,7 +641,7 @@
                 <w:sz w:val="20"/>
                 <w:szCs w:val="20"/>
               </w:rPr>
-              <w:t xml:space="preserve">Empresa industrial y comercial del Estado del orden distrital, prestadora de los servicios públicos de acueducto y alcantarillado en Bogotá.</w:t>
+              <w:t xml:space="preserve">Empresa Industrial y Comercial del Estado (EICE) del orden distrital</w:t>
             </w:r>
           </w:p>
         </w:tc>
@@ -463,7 +747,7 @@
                 <w:sz w:val="20"/>
                 <w:szCs w:val="20"/>
               </w:rPr>
-              <w:t xml:space="preserve">Equipo de Auditoría</w:t>
+              <w:t xml:space="preserve">Composición / Propietario</w:t>
             </w:r>
           </w:p>
         </w:tc>
@@ -495,7 +779,76 @@
                 <w:sz w:val="20"/>
                 <w:szCs w:val="20"/>
               </w:rPr>
-              <w:t xml:space="preserve">ANDRES FELIPE BERNAL OSORIO (Auditor Líder / Coordinación y Redacción)</w:t>
+              <w:t xml:space="preserve">100% pública (Distrito Capital de Bogotá)</w:t>
+            </w:r>
+          </w:p>
+        </w:tc>
+      </w:tr>
+      <w:tr>
+        <w:tc>
+          <w:tcPr>
+            <w:tcW w:type="dxa" w:w="2600"/>
+            <w:tcBorders>
+              <w:top w:val="single" w:color="CBD5E1" w:sz="4"/>
+              <w:left w:val="single" w:color="CBD5E1" w:sz="4"/>
+              <w:bottom w:val="single" w:color="CBD5E1" w:sz="4"/>
+              <w:right w:val="single" w:color="CBD5E1" w:sz="4"/>
+            </w:tcBorders>
+            <w:shd w:fill="F1F5F9" w:val="clear"/>
+            <w:tcMar>
+              <w:top w:type="dxa" w:w="90"/>
+              <w:left w:type="dxa" w:w="140"/>
+              <w:bottom w:type="dxa" w:w="90"/>
+              <w:right w:type="dxa" w:w="140"/>
+            </w:tcMar>
+          </w:tcPr>
+          <w:p>
+            <w:pPr>
+              <w:spacing w:after="0" w:line="276"/>
+              <w:jc w:val="left"/>
+            </w:pPr>
+            <w:r>
+              <w:rPr>
+                <w:rFonts w:ascii="Calibri" w:cs="Calibri" w:eastAsia="Calibri" w:hAnsi="Calibri"/>
+                <w:b/>
+                <w:bCs/>
+                <w:color w:val="0F4C81"/>
+                <w:sz w:val="20"/>
+                <w:szCs w:val="20"/>
+              </w:rPr>
+              <w:t xml:space="preserve">Portal Web Oficial</w:t>
+            </w:r>
+          </w:p>
+        </w:tc>
+        <w:tc>
+          <w:tcPr>
+            <w:tcW w:type="dxa" w:w="6720"/>
+            <w:tcBorders>
+              <w:top w:val="single" w:color="CBD5E1" w:sz="4"/>
+              <w:left w:val="single" w:color="CBD5E1" w:sz="4"/>
+              <w:bottom w:val="single" w:color="CBD5E1" w:sz="4"/>
+              <w:right w:val="single" w:color="CBD5E1" w:sz="4"/>
+            </w:tcBorders>
+            <w:tcMar>
+              <w:top w:type="dxa" w:w="90"/>
+              <w:left w:type="dxa" w:w="140"/>
+              <w:bottom w:type="dxa" w:w="90"/>
+              <w:right w:type="dxa" w:w="140"/>
+            </w:tcMar>
+          </w:tcPr>
+          <w:p>
+            <w:pPr>
+              <w:spacing w:after="0" w:line="276"/>
+              <w:jc w:val="left"/>
+            </w:pPr>
+            <w:r>
+              <w:rPr>
+                <w:rFonts w:ascii="Calibri" w:cs="Calibri" w:eastAsia="Calibri" w:hAnsi="Calibri"/>
+                <w:color w:val="1E293B"/>
+                <w:sz w:val="20"/>
+                <w:szCs w:val="20"/>
+              </w:rPr>
+              <w:t xml:space="preserve">https://www.acueducto.com.co</w:t>
             </w:r>
           </w:p>
         </w:tc>
@@ -564,7 +917,7 @@
                 <w:sz w:val="20"/>
                 <w:szCs w:val="20"/>
               </w:rPr>
-              <w:t xml:space="preserve">ZCPVIIA AUDITORIA DE SISTEMA</w:t>
+              <w:t xml:space="preserve">Auditoría de Sistemas (8° Semestre)</w:t>
             </w:r>
           </w:p>
         </w:tc>
@@ -601,7 +954,7 @@
                 <w:sz w:val="20"/>
                 <w:szCs w:val="20"/>
               </w:rPr>
-              <w:t xml:space="preserve">Institución</w:t>
+              <w:t xml:space="preserve">Alcance de la Auditoría</w:t>
             </w:r>
           </w:p>
         </w:tc>
@@ -633,7 +986,7 @@
                 <w:sz w:val="20"/>
                 <w:szCs w:val="20"/>
               </w:rPr>
-              <w:t xml:space="preserve">CORPORACION UNIVERSITARIA LATINOAMERICANA (CUL)</w:t>
+              <w:t xml:space="preserve">Auditoría de Sistemas de Información, Procesos y Cumplimiento Normativo</w:t>
             </w:r>
           </w:p>
         </w:tc>
@@ -670,7 +1023,7 @@
                 <w:sz w:val="20"/>
                 <w:szCs w:val="20"/>
               </w:rPr>
-              <w:t xml:space="preserve">Docente Titular</w:t>
+              <w:t xml:space="preserve">Fecha de Evaluación</w:t>
             </w:r>
           </w:p>
         </w:tc>
@@ -702,145 +1055,7 @@
                 <w:sz w:val="20"/>
                 <w:szCs w:val="20"/>
               </w:rPr>
-              <w:t xml:space="preserve">WILMER RUIZ BOTERO</w:t>
-            </w:r>
-          </w:p>
-        </w:tc>
-      </w:tr>
-      <w:tr>
-        <w:tc>
-          <w:tcPr>
-            <w:tcW w:type="dxa" w:w="2600"/>
-            <w:tcBorders>
-              <w:top w:val="single" w:color="CBD5E1" w:sz="4"/>
-              <w:left w:val="single" w:color="CBD5E1" w:sz="4"/>
-              <w:bottom w:val="single" w:color="CBD5E1" w:sz="4"/>
-              <w:right w:val="single" w:color="CBD5E1" w:sz="4"/>
-            </w:tcBorders>
-            <w:shd w:fill="F1F5F9" w:val="clear"/>
-            <w:tcMar>
-              <w:top w:type="dxa" w:w="90"/>
-              <w:left w:type="dxa" w:w="140"/>
-              <w:bottom w:type="dxa" w:w="90"/>
-              <w:right w:type="dxa" w:w="140"/>
-            </w:tcMar>
-          </w:tcPr>
-          <w:p>
-            <w:pPr>
-              <w:spacing w:after="0" w:line="276"/>
-              <w:jc w:val="left"/>
-            </w:pPr>
-            <w:r>
-              <w:rPr>
-                <w:rFonts w:ascii="Calibri" w:cs="Calibri" w:eastAsia="Calibri" w:hAnsi="Calibri"/>
-                <w:b/>
-                <w:bCs/>
-                <w:color w:val="0F4C81"/>
-                <w:sz w:val="20"/>
-                <w:szCs w:val="20"/>
-              </w:rPr>
-              <w:t xml:space="preserve">Grupo / Curso</w:t>
-            </w:r>
-          </w:p>
-        </w:tc>
-        <w:tc>
-          <w:tcPr>
-            <w:tcW w:type="dxa" w:w="6720"/>
-            <w:tcBorders>
-              <w:top w:val="single" w:color="CBD5E1" w:sz="4"/>
-              <w:left w:val="single" w:color="CBD5E1" w:sz="4"/>
-              <w:bottom w:val="single" w:color="CBD5E1" w:sz="4"/>
-              <w:right w:val="single" w:color="CBD5E1" w:sz="4"/>
-            </w:tcBorders>
-            <w:tcMar>
-              <w:top w:type="dxa" w:w="90"/>
-              <w:left w:type="dxa" w:w="140"/>
-              <w:bottom w:type="dxa" w:w="90"/>
-              <w:right w:type="dxa" w:w="140"/>
-            </w:tcMar>
-          </w:tcPr>
-          <w:p>
-            <w:pPr>
-              <w:spacing w:after="0" w:line="276"/>
-              <w:jc w:val="left"/>
-            </w:pPr>
-            <w:r>
-              <w:rPr>
-                <w:rFonts w:ascii="Calibri" w:cs="Calibri" w:eastAsia="Calibri" w:hAnsi="Calibri"/>
-                <w:color w:val="1E293B"/>
-                <w:sz w:val="20"/>
-                <w:szCs w:val="20"/>
-              </w:rPr>
-              <w:t xml:space="preserve">8° SEMESTRE</w:t>
-            </w:r>
-          </w:p>
-        </w:tc>
-      </w:tr>
-      <w:tr>
-        <w:tc>
-          <w:tcPr>
-            <w:tcW w:type="dxa" w:w="2600"/>
-            <w:tcBorders>
-              <w:top w:val="single" w:color="CBD5E1" w:sz="4"/>
-              <w:left w:val="single" w:color="CBD5E1" w:sz="4"/>
-              <w:bottom w:val="single" w:color="CBD5E1" w:sz="4"/>
-              <w:right w:val="single" w:color="CBD5E1" w:sz="4"/>
-            </w:tcBorders>
-            <w:shd w:fill="F1F5F9" w:val="clear"/>
-            <w:tcMar>
-              <w:top w:type="dxa" w:w="90"/>
-              <w:left w:type="dxa" w:w="140"/>
-              <w:bottom w:type="dxa" w:w="90"/>
-              <w:right w:type="dxa" w:w="140"/>
-            </w:tcMar>
-          </w:tcPr>
-          <w:p>
-            <w:pPr>
-              <w:spacing w:after="0" w:line="276"/>
-              <w:jc w:val="left"/>
-            </w:pPr>
-            <w:r>
-              <w:rPr>
-                <w:rFonts w:ascii="Calibri" w:cs="Calibri" w:eastAsia="Calibri" w:hAnsi="Calibri"/>
-                <w:b/>
-                <w:bCs/>
-                <w:color w:val="0F4C81"/>
-                <w:sz w:val="20"/>
-                <w:szCs w:val="20"/>
-              </w:rPr>
-              <w:t xml:space="preserve">Ciudad / Fecha</w:t>
-            </w:r>
-          </w:p>
-        </w:tc>
-        <w:tc>
-          <w:tcPr>
-            <w:tcW w:type="dxa" w:w="6720"/>
-            <w:tcBorders>
-              <w:top w:val="single" w:color="CBD5E1" w:sz="4"/>
-              <w:left w:val="single" w:color="CBD5E1" w:sz="4"/>
-              <w:bottom w:val="single" w:color="CBD5E1" w:sz="4"/>
-              <w:right w:val="single" w:color="CBD5E1" w:sz="4"/>
-            </w:tcBorders>
-            <w:tcMar>
-              <w:top w:type="dxa" w:w="90"/>
-              <w:left w:type="dxa" w:w="140"/>
-              <w:bottom w:type="dxa" w:w="90"/>
-              <w:right w:type="dxa" w:w="140"/>
-            </w:tcMar>
-          </w:tcPr>
-          <w:p>
-            <w:pPr>
-              <w:spacing w:after="0" w:line="276"/>
-              <w:jc w:val="left"/>
-            </w:pPr>
-            <w:r>
-              <w:rPr>
-                <w:rFonts w:ascii="Calibri" w:cs="Calibri" w:eastAsia="Calibri" w:hAnsi="Calibri"/>
-                <w:color w:val="1E293B"/>
-                <w:sz w:val="20"/>
-                <w:szCs w:val="20"/>
-              </w:rPr>
-              <w:t xml:space="preserve">BARRANQUILLA · 23 de agosto de 2026</w:t>
+              <w:t xml:space="preserve">Barranquilla · 31 de agosto de 2026</w:t>
             </w:r>
           </w:p>
         </w:tc>
@@ -963,7 +1178,7 @@
         </w:rPr>
         <w:t xml:space="preserve">Contacto Oficial: PBX (+57) 601 344 7000 · Línea de Atención 116 · Portal: </w:t>
       </w:r>
-      <w:hyperlink w:history="1" r:id="rIdzyvm58enr8rdqgbpoagxl">
+      <w:hyperlink w:history="1" r:id="rId0zyja6wm--iv7fxxntkz_">
         <w:r>
           <w:rPr>
             <w:rFonts w:ascii="Calibri" w:cs="Calibri" w:eastAsia="Calibri" w:hAnsi="Calibri"/>
@@ -1087,7 +1302,7 @@
       <w:pPr>
         <w:spacing w:after="100"/>
       </w:pPr>
-      <w:hyperlink w:history="1" r:id="rId7rrfwezs4koqlijojwnpg">
+      <w:hyperlink w:history="1" r:id="rIdnhnff0xhpab4ek9a1eerq">
         <w:r>
           <w:rPr>
             <w:rFonts w:ascii="Calibri" w:cs="Calibri" w:eastAsia="Calibri" w:hAnsi="Calibri"/>
@@ -1104,7 +1319,7 @@
       <w:pPr>
         <w:spacing w:after="100"/>
       </w:pPr>
-      <w:hyperlink w:history="1" r:id="rId2oahvooi2car1iikhrfzj">
+      <w:hyperlink w:history="1" r:id="rIdrm71lwfnh32uxz7iisvfb">
         <w:r>
           <w:rPr>
             <w:rFonts w:ascii="Calibri" w:cs="Calibri" w:eastAsia="Calibri" w:hAnsi="Calibri"/>
@@ -1284,7 +1499,7 @@
       <w:pPr>
         <w:spacing w:after="100"/>
       </w:pPr>
-      <w:hyperlink w:history="1" r:id="rIdj3eyiicfqsfs1wr-nocu3">
+      <w:hyperlink w:history="1" r:id="rId49pjywpcnj2azvoxbdjos">
         <w:r>
           <w:rPr>
             <w:rFonts w:ascii="Calibri" w:cs="Calibri" w:eastAsia="Calibri" w:hAnsi="Calibri"/>
@@ -1301,7 +1516,7 @@
       <w:pPr>
         <w:spacing w:after="100"/>
       </w:pPr>
-      <w:hyperlink w:history="1" r:id="rIdb8sqdwgq4q8b6gpzqiolc">
+      <w:hyperlink w:history="1" r:id="rIduwm8o0hseyshqkrwm4vnu">
         <w:r>
           <w:rPr>
             <w:rFonts w:ascii="Calibri" w:cs="Calibri" w:eastAsia="Calibri" w:hAnsi="Calibri"/>
@@ -1481,7 +1696,7 @@
       <w:pPr>
         <w:spacing w:after="100"/>
       </w:pPr>
-      <w:hyperlink w:history="1" r:id="rIdmkxmiswfdbxwjklnesnhl">
+      <w:hyperlink w:history="1" r:id="rId8mm5krdt1sqleu3ss31lo">
         <w:r>
           <w:rPr>
             <w:rFonts w:ascii="Calibri" w:cs="Calibri" w:eastAsia="Calibri" w:hAnsi="Calibri"/>
@@ -1498,7 +1713,7 @@
       <w:pPr>
         <w:spacing w:after="100"/>
       </w:pPr>
-      <w:hyperlink w:history="1" r:id="rIdcxpugb4qk3ingpwsbbfi3">
+      <w:hyperlink w:history="1" r:id="rIdfkmwrwdcanxot0_nwnkjz">
         <w:r>
           <w:rPr>
             <w:rFonts w:ascii="Calibri" w:cs="Calibri" w:eastAsia="Calibri" w:hAnsi="Calibri"/>
@@ -1721,7 +1936,7 @@
       <w:pPr>
         <w:spacing w:after="100"/>
       </w:pPr>
-      <w:hyperlink w:history="1" r:id="rIdzs5f4lzkn1odi9uc4anhv">
+      <w:hyperlink w:history="1" r:id="rIdkdrikms1pvwuuwgn1-hp1">
         <w:r>
           <w:rPr>
             <w:rFonts w:ascii="Calibri" w:cs="Calibri" w:eastAsia="Calibri" w:hAnsi="Calibri"/>
@@ -1956,7 +2171,7 @@
       <w:pPr>
         <w:spacing w:after="100"/>
       </w:pPr>
-      <w:hyperlink w:history="1" r:id="rIdrvbnrju5sw9kltzt1ehsk">
+      <w:hyperlink w:history="1" r:id="rIdrkntzznql7fjmomex_lab">
         <w:r>
           <w:rPr>
             <w:rFonts w:ascii="Calibri" w:cs="Calibri" w:eastAsia="Calibri" w:hAnsi="Calibri"/>
@@ -1973,7 +2188,7 @@
       <w:pPr>
         <w:spacing w:after="100"/>
       </w:pPr>
-      <w:hyperlink w:history="1" r:id="rId6fuqwepqfr6tn_pmfovur">
+      <w:hyperlink w:history="1" r:id="rIdx8kxcvyjdcgcmvgaqwcpp">
         <w:r>
           <w:rPr>
             <w:rFonts w:ascii="Calibri" w:cs="Calibri" w:eastAsia="Calibri" w:hAnsi="Calibri"/>
@@ -2076,7 +2291,7 @@
       <w:pPr>
         <w:spacing w:after="100"/>
       </w:pPr>
-      <w:hyperlink w:history="1" r:id="rIdve7edw1u9vi4vx9mcu1ik">
+      <w:hyperlink w:history="1" r:id="rIdqquyfbz9ewxppbw0l1xlu">
         <w:r>
           <w:rPr>
             <w:rFonts w:ascii="Calibri" w:cs="Calibri" w:eastAsia="Calibri" w:hAnsi="Calibri"/>
@@ -2112,7 +2327,7 @@
       <w:pPr>
         <w:spacing w:after="100"/>
       </w:pPr>
-      <w:hyperlink w:history="1" r:id="rIdiji_czdkq6phcuhqjkion">
+      <w:hyperlink w:history="1" r:id="rIdjvm7zzoci2fd8jggjraed">
         <w:r>
           <w:rPr>
             <w:rFonts w:ascii="Calibri" w:cs="Calibri" w:eastAsia="Calibri" w:hAnsi="Calibri"/>
@@ -2192,7 +2407,7 @@
       <w:pPr>
         <w:spacing w:after="100"/>
       </w:pPr>
-      <w:hyperlink w:history="1" r:id="rIdqqazkd2apfu5wy1dkyxmx">
+      <w:hyperlink w:history="1" r:id="rIdsic4jtop79hqnygh4jsol">
         <w:r>
           <w:rPr>
             <w:rFonts w:ascii="Calibri" w:cs="Calibri" w:eastAsia="Calibri" w:hAnsi="Calibri"/>
@@ -2377,7 +2592,7 @@
       <w:pPr>
         <w:spacing w:after="100"/>
       </w:pPr>
-      <w:hyperlink w:history="1" r:id="rIduaw_cky4hj74zj7jbgoxx">
+      <w:hyperlink w:history="1" r:id="rIdq-vg-uzofrjyicwrmcau2">
         <w:r>
           <w:rPr>
             <w:rFonts w:ascii="Calibri" w:cs="Calibri" w:eastAsia="Calibri" w:hAnsi="Calibri"/>
@@ -2394,7 +2609,7 @@
       <w:pPr>
         <w:spacing w:after="100"/>
       </w:pPr>
-      <w:hyperlink w:history="1" r:id="rIdzmy_t2-ucgjjuaea-cjds">
+      <w:hyperlink w:history="1" r:id="rIdsf9gj07fobjoj4dcyblnx">
         <w:r>
           <w:rPr>
             <w:rFonts w:ascii="Calibri" w:cs="Calibri" w:eastAsia="Calibri" w:hAnsi="Calibri"/>
@@ -2663,7 +2878,7 @@
       <w:pPr>
         <w:spacing w:after="100"/>
       </w:pPr>
-      <w:hyperlink w:history="1" r:id="rIduilwf5dp0iy7-k_7bhttu">
+      <w:hyperlink w:history="1" r:id="rIdhyrv_pcrpcqgzgvru_8gc">
         <w:r>
           <w:rPr>
             <w:rFonts w:ascii="Calibri" w:cs="Calibri" w:eastAsia="Calibri" w:hAnsi="Calibri"/>
@@ -2680,7 +2895,7 @@
       <w:pPr>
         <w:spacing w:after="100"/>
       </w:pPr>
-      <w:hyperlink w:history="1" r:id="rIdoxwllwu5vsqg7lzwcy6-f">
+      <w:hyperlink w:history="1" r:id="rIdiardo3b88dkj7iunjt-nn">
         <w:r>
           <w:rPr>
             <w:rFonts w:ascii="Calibri" w:cs="Calibri" w:eastAsia="Calibri" w:hAnsi="Calibri"/>
@@ -2961,7 +3176,7 @@
       <w:pPr>
         <w:spacing w:after="100"/>
       </w:pPr>
-      <w:hyperlink w:history="1" r:id="rIdrlvbzsqx8n7yssykdw6su">
+      <w:hyperlink w:history="1" r:id="rIdshbzjc7ugykwp1qgi_gfl">
         <w:r>
           <w:rPr>
             <w:rFonts w:ascii="Calibri" w:cs="Calibri" w:eastAsia="Calibri" w:hAnsi="Calibri"/>
@@ -2978,7 +3193,7 @@
       <w:pPr>
         <w:spacing w:after="100"/>
       </w:pPr>
-      <w:hyperlink w:history="1" r:id="rIdyntacbmqu2kuuqfdgozpb">
+      <w:hyperlink w:history="1" r:id="rIdkk6ir0p0nm1ypg5tb5hpy">
         <w:r>
           <w:rPr>
             <w:rFonts w:ascii="Calibri" w:cs="Calibri" w:eastAsia="Calibri" w:hAnsi="Calibri"/>
@@ -3144,7 +3359,7 @@
       <w:pPr>
         <w:spacing w:after="100"/>
       </w:pPr>
-      <w:hyperlink w:history="1" r:id="rIdksrpcj97ezkfwf15zwi6y">
+      <w:hyperlink w:history="1" r:id="rIdsntilvd18kw6mzlwpmtmt">
         <w:r>
           <w:rPr>
             <w:rFonts w:ascii="Calibri" w:cs="Calibri" w:eastAsia="Calibri" w:hAnsi="Calibri"/>
@@ -3329,7 +3544,7 @@
       <w:pPr>
         <w:spacing w:after="100"/>
       </w:pPr>
-      <w:hyperlink w:history="1" r:id="rIdbnhr0joqnmqub-mjndenf">
+      <w:hyperlink w:history="1" r:id="rId4evm5veafuv8lomwtnwbp">
         <w:r>
           <w:rPr>
             <w:rFonts w:ascii="Calibri" w:cs="Calibri" w:eastAsia="Calibri" w:hAnsi="Calibri"/>
@@ -3361,7 +3576,7 @@
     </w:p>
     <w:p>
       <w:pPr>
-        <w:spacing w:after="80" w:line="276"/>
+        <w:spacing w:after="60" w:line="276"/>
         <w:ind w:left="400" w:hanging="400"/>
       </w:pPr>
       <w:r>
@@ -3382,9 +3597,9 @@
           <w:sz w:val="20"/>
           <w:szCs w:val="20"/>
         </w:rPr>
-        <w:t xml:space="preserve">Empresa de Acueducto y Alcantarillado de Bogotá E.S.P. (EAAB-ESP). (2026). EAAB — Misión, visión, funciones y deberes (y valores). Recuperado el 23 de agosto de 2026, de </w:t>
-      </w:r>
-      <w:hyperlink w:history="1" r:id="rIdjb0bxjbxyfrcvit1pxwxc">
+        <w:t xml:space="preserve">Empresa de Acueducto y Alcantarillado de Bogotá E.S.P. (EAAB-ESP). (2026). Misión, visión, funciones y deberes institucionales. Recuperado el 23 de agosto de 2026, de </w:t>
+      </w:r>
+      <w:hyperlink w:history="1" r:id="rIdcqizvtkgonc8nzantn2fr">
         <w:r>
           <w:rPr>
             <w:rFonts w:ascii="Calibri" w:cs="Calibri" w:eastAsia="Calibri" w:hAnsi="Calibri"/>
@@ -3411,12 +3626,12 @@
           <w:sz w:val="18"/>
           <w:szCs w:val="18"/>
         </w:rPr>
-        <w:t xml:space="preserve">Contexto: Encabezados literales Misión, Visión y Valores corporativos. Acuerdos y manual de funciones.</w:t>
-      </w:r>
-    </w:p>
-    <w:p>
-      <w:pPr>
-        <w:spacing w:after="80" w:line="276"/>
+        <w:t xml:space="preserve">Contexto: Encabezados literales de Misión, Visión y Valores corporativos.</w:t>
+      </w:r>
+    </w:p>
+    <w:p>
+      <w:pPr>
+        <w:spacing w:after="60" w:line="276"/>
         <w:ind w:left="400" w:hanging="400"/>
       </w:pPr>
       <w:r>
@@ -3437,9 +3652,9 @@
           <w:sz w:val="20"/>
           <w:szCs w:val="20"/>
         </w:rPr>
-        <w:t xml:space="preserve">Empresa de Acueducto y Alcantarillado de Bogotá E.S.P. (EAAB-ESP). (2026). EAAB — Transparencia y acceso a la información pública (Ley 1712). Recuperado el 23 de agosto de 2026, de </w:t>
-      </w:r>
-      <w:hyperlink w:history="1" r:id="rIdptiqttdyzp9954bgz_zkt">
+        <w:t xml:space="preserve">Empresa de Acueducto y Alcantarillado de Bogotá E.S.P. (EAAB-ESP). (2026). Portal de Transparencia y Acceso a la Información Pública (Ley 1712 de 2014). Recuperado el 23 de agosto de 2026, de </w:t>
+      </w:r>
+      <w:hyperlink w:history="1" r:id="rId3d9soidcz7sdnnesu6jbr">
         <w:r>
           <w:rPr>
             <w:rFonts w:ascii="Calibri" w:cs="Calibri" w:eastAsia="Calibri" w:hAnsi="Calibri"/>
@@ -3466,12 +3681,12 @@
           <w:sz w:val="18"/>
           <w:szCs w:val="18"/>
         </w:rPr>
-        <w:t xml:space="preserve">Contexto: Índice legal: entidad, organigrama, procesos, normativa, grupos de interés.</w:t>
-      </w:r>
-    </w:p>
-    <w:p>
-      <w:pPr>
-        <w:spacing w:after="80" w:line="276"/>
+        <w:t xml:space="preserve">Contexto: Índice de información obligatoria: estructura, normatividad y planeación.</w:t>
+      </w:r>
+    </w:p>
+    <w:p>
+      <w:pPr>
+        <w:spacing w:after="60" w:line="276"/>
         <w:ind w:left="400" w:hanging="400"/>
       </w:pPr>
       <w:r>
@@ -3492,9 +3707,9 @@
           <w:sz w:val="20"/>
           <w:szCs w:val="20"/>
         </w:rPr>
-        <w:t xml:space="preserve">Empresa de Acueducto y Alcantarillado de Bogotá E.S.P. (EAAB-ESP). (2026). Organigrama EAAB-ESP (PDF, 18 de agosto de 2026). Recuperado el 23 de agosto de 2026, de </w:t>
-      </w:r>
-      <w:hyperlink w:history="1" r:id="rId5m-df2ovek70kp5w6cjgi">
+        <w:t xml:space="preserve">Empresa de Acueducto y Alcantarillado de Bogotá E.S.P. (EAAB-ESP). (2026). Organigrama general de la entidad (Actualizado a 18 de agosto de 2026). Recuperado el 23 de agosto de 2026, de </w:t>
+      </w:r>
+      <w:hyperlink w:history="1" r:id="rIdacqe7j3qt_godfxkclcyw">
         <w:r>
           <w:rPr>
             <w:rFonts w:ascii="Calibri" w:cs="Calibri" w:eastAsia="Calibri" w:hAnsi="Calibri"/>
@@ -3521,12 +3736,12 @@
           <w:sz w:val="18"/>
           <w:szCs w:val="18"/>
         </w:rPr>
-        <w:t xml:space="preserve">Contexto: Gerencia General Natasha Avendaño García y gerencias de primer nivel.</w:t>
-      </w:r>
-    </w:p>
-    <w:p>
-      <w:pPr>
-        <w:spacing w:after="80" w:line="276"/>
+        <w:t xml:space="preserve">Contexto: Gerencia General Dra. Natasha Avendaño García y gerencias corporativas de primer nivel.</w:t>
+      </w:r>
+    </w:p>
+    <w:p>
+      <w:pPr>
+        <w:spacing w:after="60" w:line="276"/>
         <w:ind w:left="400" w:hanging="400"/>
       </w:pPr>
       <w:r>
@@ -3547,9 +3762,9 @@
           <w:sz w:val="20"/>
           <w:szCs w:val="20"/>
         </w:rPr>
-        <w:t xml:space="preserve">Empresa de Acueducto y Alcantarillado de Bogotá E.S.P. (EAAB-ESP). (2026). EAAB — Visión y misión (página institucional). Recuperado el 23 de agosto de 2026, de </w:t>
-      </w:r>
-      <w:hyperlink w:history="1" r:id="rId0uf2wrkicda-pnbcd8-tp">
+        <w:t xml:space="preserve">Empresa de Acueducto y Alcantarillado de Bogotá E.S.P. (EAAB-ESP). (2026). Visión y misión empresarial. Recuperado el 23 de agosto de 2026, de </w:t>
+      </w:r>
+      <w:hyperlink w:history="1" r:id="rId2gvc-dbeswk3f3le63bvg">
         <w:r>
           <w:rPr>
             <w:rFonts w:ascii="Calibri" w:cs="Calibri" w:eastAsia="Calibri" w:hAnsi="Calibri"/>
@@ -3576,12 +3791,12 @@
           <w:sz w:val="18"/>
           <w:szCs w:val="18"/>
         </w:rPr>
-        <w:t xml:space="preserve">Contexto: Misma misión y visión, encabezados literales.</w:t>
-      </w:r>
-    </w:p>
-    <w:p>
-      <w:pPr>
-        <w:spacing w:after="80" w:line="276"/>
+        <w:t xml:space="preserve">Contexto: Publicación institucional de direccionamiento estratégico.</w:t>
+      </w:r>
+    </w:p>
+    <w:p>
+      <w:pPr>
+        <w:spacing w:after="60" w:line="276"/>
         <w:ind w:left="400" w:hanging="400"/>
       </w:pPr>
       <w:r>
@@ -3602,9 +3817,9 @@
           <w:sz w:val="20"/>
           <w:szCs w:val="20"/>
         </w:rPr>
-        <w:t xml:space="preserve">Empresa de Acueducto y Alcantarillado de Bogotá E.S.P. (EAAB-ESP). (2026). Estructura orgánica - organigrama (ficha Transparencia). Recuperado el 23 de agosto de 2026, de </w:t>
-      </w:r>
-      <w:hyperlink w:history="1" r:id="rIdx-vaxqo_fsn0uafynssno">
+        <w:t xml:space="preserve">Empresa de Acueducto y Alcantarillado de Bogotá E.S.P. (EAAB-ESP). (2026). Estructura orgánica y funciones. Recuperado el 23 de agosto de 2026, de </w:t>
+      </w:r>
+      <w:hyperlink w:history="1" r:id="rIdm9dc0lkzmicqsf31uuezi">
         <w:r>
           <w:rPr>
             <w:rFonts w:ascii="Calibri" w:cs="Calibri" w:eastAsia="Calibri" w:hAnsi="Calibri"/>
@@ -3631,12 +3846,12 @@
           <w:sz w:val="18"/>
           <w:szCs w:val="18"/>
         </w:rPr>
-        <w:t xml:space="preserve">Contexto: Publicación 19 de agosto de 2026.</w:t>
-      </w:r>
-    </w:p>
-    <w:p>
-      <w:pPr>
-        <w:spacing w:after="80" w:line="276"/>
+        <w:t xml:space="preserve">Contexto: Ficha técnica de dependencias y acuerdos de Junta Directiva.</w:t>
+      </w:r>
+    </w:p>
+    <w:p>
+      <w:pPr>
+        <w:spacing w:after="60" w:line="276"/>
         <w:ind w:left="400" w:hanging="400"/>
       </w:pPr>
       <w:r>
@@ -3657,9 +3872,9 @@
           <w:sz w:val="20"/>
           <w:szCs w:val="20"/>
         </w:rPr>
-        <w:t xml:space="preserve">Empresa de Acueducto y Alcantarillado de Bogotá E.S.P. (EAAB-ESP). (2026). EAAB — Responsabilidad social empresarial. Recuperado el 23 de agosto de 2026, de </w:t>
-      </w:r>
-      <w:hyperlink w:history="1" r:id="rId7omfak_ipizqelt53xxuf">
+        <w:t xml:space="preserve">Empresa de Acueducto y Alcantarillado de Bogotá E.S.P. (EAAB-ESP). (2026). Responsabilidad social empresarial y gestión ambiental. Recuperado el 23 de agosto de 2026, de </w:t>
+      </w:r>
+      <w:hyperlink w:history="1" r:id="rIdoxcwg_xme4ii_lvk2a230">
         <w:r>
           <w:rPr>
             <w:rFonts w:ascii="Calibri" w:cs="Calibri" w:eastAsia="Calibri" w:hAnsi="Calibri"/>
@@ -3686,12 +3901,12 @@
           <w:sz w:val="18"/>
           <w:szCs w:val="18"/>
         </w:rPr>
-        <w:t xml:space="preserve">Contexto: Programa ambientalmente sostenibles y entorno ambiental.</w:t>
-      </w:r>
-    </w:p>
-    <w:p>
-      <w:pPr>
-        <w:spacing w:after="80" w:line="276"/>
+        <w:t xml:space="preserve">Contexto: Programa 'Ambientalmente sostenibles' y Sistema Único de Gestión.</w:t>
+      </w:r>
+    </w:p>
+    <w:p>
+      <w:pPr>
+        <w:spacing w:after="60" w:line="276"/>
         <w:ind w:left="400" w:hanging="400"/>
       </w:pPr>
       <w:r>
@@ -3712,9 +3927,9 @@
           <w:sz w:val="20"/>
           <w:szCs w:val="20"/>
         </w:rPr>
-        <w:t xml:space="preserve">Departamento Administrativo de la Función Pública. (2014). Ley 1712 de 2014 — transparencia y acceso a la información pública. Recuperado el 23 de agosto de 2026, de </w:t>
-      </w:r>
-      <w:hyperlink w:history="1" r:id="rIdcj576poez_nwrxdvkbjs6">
+        <w:t xml:space="preserve">Departamento Administrativo de la Función Pública. (2014). Ley 1712 de 2014 — Ley de Transparencia y del Derecho de Acceso a la Información Pública Nacional. Recuperado el 23 de agosto de 2026, de </w:t>
+      </w:r>
+      <w:hyperlink w:history="1" r:id="rId6ijplteyeslwakwakahji">
         <w:r>
           <w:rPr>
             <w:rFonts w:ascii="Calibri" w:cs="Calibri" w:eastAsia="Calibri" w:hAnsi="Calibri"/>
@@ -3741,12 +3956,12 @@
           <w:sz w:val="18"/>
           <w:szCs w:val="18"/>
         </w:rPr>
-        <w:t xml:space="preserve">Contexto: Obliga a publicar misión, visión, funciones, organigrama y procesos.</w:t>
-      </w:r>
-    </w:p>
-    <w:p>
-      <w:pPr>
-        <w:spacing w:after="80" w:line="276"/>
+        <w:t xml:space="preserve">Contexto: Marco legal para la publicación proactiva de información pública.</w:t>
+      </w:r>
+    </w:p>
+    <w:p>
+      <w:pPr>
+        <w:spacing w:after="60" w:line="276"/>
         <w:ind w:left="400" w:hanging="400"/>
       </w:pPr>
       <w:r>
@@ -3767,9 +3982,9 @@
           <w:sz w:val="20"/>
           <w:szCs w:val="20"/>
         </w:rPr>
-        <w:t xml:space="preserve">Departamento Administrativo de la Función Pública. (1994). Ley 142 de 1994 — régimen de servicios públicos domiciliarios. Recuperado el 23 de agosto de 2026, de </w:t>
-      </w:r>
-      <w:hyperlink w:history="1" r:id="rId099ecckuic5ygg6tfc7sy">
+        <w:t xml:space="preserve">Departamento Administrativo de la Función Pública. (1994). Ley 142 de 1994 — Régimen de los Servicios Públicos Domiciliarios. Recuperado el 23 de agosto de 2026, de </w:t>
+      </w:r>
+      <w:hyperlink w:history="1" r:id="rId-uv5qi3o5n0wno0pkulec">
         <w:r>
           <w:rPr>
             <w:rFonts w:ascii="Calibri" w:cs="Calibri" w:eastAsia="Calibri" w:hAnsi="Calibri"/>
@@ -3796,12 +4011,12 @@
           <w:sz w:val="18"/>
           <w:szCs w:val="18"/>
         </w:rPr>
-        <w:t xml:space="preserve">Contexto: Marco del objeto social de la EAAB-ESP.</w:t>
-      </w:r>
-    </w:p>
-    <w:p>
-      <w:pPr>
-        <w:spacing w:after="80" w:line="276"/>
+        <w:t xml:space="preserve">Contexto: Marco regulatorio del objeto social de la EAAB-ESP.</w:t>
+      </w:r>
+    </w:p>
+    <w:p>
+      <w:pPr>
+        <w:spacing w:after="60" w:line="276"/>
         <w:ind w:left="400" w:hanging="400"/>
       </w:pPr>
       <w:r>
@@ -3822,9 +4037,9 @@
           <w:sz w:val="20"/>
           <w:szCs w:val="20"/>
         </w:rPr>
-        <w:t xml:space="preserve">Empresa de Acueducto y Alcantarillado de Bogotá E.S.P. (EAAB-ESP). (2026). Términos y condiciones del sitio (NIT y domicilio). Recuperado el 23 de agosto de 2026, de </w:t>
-      </w:r>
-      <w:hyperlink w:history="1" r:id="rIdtenw6xmjmojbyzigjz8v7">
+        <w:t xml:space="preserve">Empresa de Acueducto y Alcantarillado de Bogotá E.S.P. (EAAB-ESP). (2026). Términos, condiciones y datos corporativos. Recuperado el 23 de agosto de 2026, de </w:t>
+      </w:r>
+      <w:hyperlink w:history="1" r:id="rIdo3ib2kxoi3dxkslpuyenj">
         <w:r>
           <w:rPr>
             <w:rFonts w:ascii="Calibri" w:cs="Calibri" w:eastAsia="Calibri" w:hAnsi="Calibri"/>
@@ -3851,12 +4066,12 @@
           <w:sz w:val="18"/>
           <w:szCs w:val="18"/>
         </w:rPr>
-        <w:t xml:space="preserve">Contexto: Razón social EAAB-ESP, NIT 899.999.094, Av. Calle 24 No. 37-15.</w:t>
-      </w:r>
-    </w:p>
-    <w:p>
-      <w:pPr>
-        <w:spacing w:after="80" w:line="276"/>
+        <w:t xml:space="preserve">Contexto: Razón social oficial, NIT 899.999.094-1 y domicilio principal.</w:t>
+      </w:r>
+    </w:p>
+    <w:p>
+      <w:pPr>
+        <w:spacing w:after="60" w:line="276"/>
         <w:ind w:left="400" w:hanging="400"/>
       </w:pPr>
       <w:r>
@@ -3877,9 +4092,9 @@
           <w:sz w:val="20"/>
           <w:szCs w:val="20"/>
         </w:rPr>
-        <w:t xml:space="preserve">Empresa de Acueducto y Alcantarillado de Bogotá E.S.P. (EAAB-ESP). (2026). EAAB — Planeación, presupuesto e informes. Recuperado el 23 de agosto de 2026, de </w:t>
-      </w:r>
-      <w:hyperlink w:history="1" r:id="rIdwtd-r-56leqz9sq2nzc0e">
+        <w:t xml:space="preserve">Empresa de Acueducto y Alcantarillado de Bogotá E.S.P. (EAAB-ESP). (2026). Planeación, presupuesto e informes financieros. Recuperado el 23 de agosto de 2026, de </w:t>
+      </w:r>
+      <w:hyperlink w:history="1" r:id="rIdtdm8xfgaj1om1nk5jhggs">
         <w:r>
           <w:rPr>
             <w:rFonts w:ascii="Calibri" w:cs="Calibri" w:eastAsia="Calibri" w:hAnsi="Calibri"/>
@@ -3906,12 +4121,12 @@
           <w:sz w:val="18"/>
           <w:szCs w:val="18"/>
         </w:rPr>
-        <w:t xml:space="preserve">Contexto: Índice para estados y presupuesto. El PDF del período se sube a la bitácora.</w:t>
-      </w:r>
-    </w:p>
-    <w:p>
-      <w:pPr>
-        <w:spacing w:after="80" w:line="276"/>
+        <w:t xml:space="preserve">Contexto: Ejecución presupuestal y estados financieros auditados.</w:t>
+      </w:r>
+    </w:p>
+    <w:p>
+      <w:pPr>
+        <w:spacing w:after="60" w:line="276"/>
         <w:ind w:left="400" w:hanging="400"/>
       </w:pPr>
       <w:r>
@@ -3932,9 +4147,9 @@
           <w:sz w:val="20"/>
           <w:szCs w:val="20"/>
         </w:rPr>
-        <w:t xml:space="preserve">Empresa de Acueducto y Alcantarillado de Bogotá E.S.P. (EAAB-ESP). (2026). EAAB — Grupos de interés. Recuperado el 23 de agosto de 2026, de </w:t>
-      </w:r>
-      <w:hyperlink w:history="1" r:id="rIdlnzhtvy9arc7vjwfc1e58">
+        <w:t xml:space="preserve">Empresa de Acueducto y Alcantarillado de Bogotá E.S.P. (EAAB-ESP). (2026). Caracterización y diálogo con grupos de interés. Recuperado el 23 de agosto de 2026, de </w:t>
+      </w:r>
+      <w:hyperlink w:history="1" r:id="rIdzrrkzaxl7v6i_-zw5tfhn">
         <w:r>
           <w:rPr>
             <w:rFonts w:ascii="Calibri" w:cs="Calibri" w:eastAsia="Calibri" w:hAnsi="Calibri"/>
@@ -3961,12 +4176,12 @@
           <w:sz w:val="18"/>
           <w:szCs w:val="18"/>
         </w:rPr>
-        <w:t xml:space="preserve">Contexto: Usuarios, comunidad, servidores, proveedores, autoridad, organizaciones, medios, academia, Junta.</w:t>
-      </w:r>
-    </w:p>
-    <w:p>
-      <w:pPr>
-        <w:spacing w:after="80" w:line="276"/>
+        <w:t xml:space="preserve">Contexto: Identificación de los 9 grupos de valor y encuestas de satisfacción.</w:t>
+      </w:r>
+    </w:p>
+    <w:p>
+      <w:pPr>
+        <w:spacing w:after="60" w:line="276"/>
         <w:ind w:left="400" w:hanging="400"/>
       </w:pPr>
       <w:r>
@@ -3987,9 +4202,9 @@
           <w:sz w:val="20"/>
           <w:szCs w:val="20"/>
         </w:rPr>
-        <w:t xml:space="preserve">Empresa de Acueducto y Alcantarillado de Bogotá E.S.P. (EAAB-ESP). (2026). Mapas y cartas descriptivas de los procesos. Recuperado el 23 de agosto de 2026, de </w:t>
-      </w:r>
-      <w:hyperlink w:history="1" r:id="rIdazxyrddnnlosfvgrhkjzy">
+        <w:t xml:space="preserve">Empresa de Acueducto y Alcantarillado de Bogotá E.S.P. (EAAB-ESP). (2026). Mapas y cartas descriptivas de los procesos institucionales. Recuperado el 23 de agosto de 2026, de </w:t>
+      </w:r>
+      <w:hyperlink w:history="1" r:id="rIdpy3ls5ytmtkskqzbeilpb">
         <w:r>
           <w:rPr>
             <w:rFonts w:ascii="Calibri" w:cs="Calibri" w:eastAsia="Calibri" w:hAnsi="Calibri"/>
@@ -4016,7 +4231,7 @@
           <w:sz w:val="18"/>
           <w:szCs w:val="18"/>
         </w:rPr>
-        <w:t xml:space="preserve">Contexto: Procedimientos internos publicados por Ley 1712.</w:t>
+        <w:t xml:space="preserve">Contexto: Arquitectura de procesos misionales, estratégicos y de apoyo.</w:t>
       </w:r>
     </w:p>
     <w:sectPr>
@@ -4085,7 +4300,7 @@
         <w:sz w:val="16"/>
         <w:szCs w:val="16"/>
       </w:rPr>
-      <w:t xml:space="preserve">Generado: 23 de ago de 2026, 07:04 p. m.   ·   Página </w:t>
+      <w:t xml:space="preserve">Corporación Universitaria Latinoamericana (CUL)   ·   Página </w:t>
     </w:r>
     <w:r>
       <w:rPr>
@@ -4153,7 +4368,7 @@
         <w:sz w:val="16"/>
         <w:szCs w:val="16"/>
       </w:rPr>
-      <w:t xml:space="preserve">Bitácora de Auditoría  ·  EAAB (NIT 899.999.094-1)</w:t>
+      <w:t xml:space="preserve">Bitácora de Auditoría  ·  EAAB-ESP (NIT 899.999.094-1)</w:t>
     </w:r>
   </w:p>
 </w:hdr>

</xml_diff>

<commit_message>
Cerrar Word automáticamente cuando el archivo está bloqueado al descargar
</commit_message>
<xml_diff>
--- a/public/exports/Bitacora_EAAB.docx
+++ b/public/exports/Bitacora_EAAB.docx
@@ -1178,7 +1178,7 @@
         </w:rPr>
         <w:t xml:space="preserve">Contacto Oficial: PBX (+57) 601 344 7000 · Línea de Atención 116 · Portal: </w:t>
       </w:r>
-      <w:hyperlink w:history="1" r:id="rId0zyja6wm--iv7fxxntkz_">
+      <w:hyperlink w:history="1" r:id="rIdaz-8zjtejd7kzfycurove">
         <w:r>
           <w:rPr>
             <w:rFonts w:ascii="Calibri" w:cs="Calibri" w:eastAsia="Calibri" w:hAnsi="Calibri"/>
@@ -1302,7 +1302,7 @@
       <w:pPr>
         <w:spacing w:after="100"/>
       </w:pPr>
-      <w:hyperlink w:history="1" r:id="rIdnhnff0xhpab4ek9a1eerq">
+      <w:hyperlink w:history="1" r:id="rIdjcbdk2xupprin6g349esd">
         <w:r>
           <w:rPr>
             <w:rFonts w:ascii="Calibri" w:cs="Calibri" w:eastAsia="Calibri" w:hAnsi="Calibri"/>
@@ -1319,7 +1319,7 @@
       <w:pPr>
         <w:spacing w:after="100"/>
       </w:pPr>
-      <w:hyperlink w:history="1" r:id="rIdrm71lwfnh32uxz7iisvfb">
+      <w:hyperlink w:history="1" r:id="rIduwhzf5sz6_tnguntry6qv">
         <w:r>
           <w:rPr>
             <w:rFonts w:ascii="Calibri" w:cs="Calibri" w:eastAsia="Calibri" w:hAnsi="Calibri"/>
@@ -1499,7 +1499,7 @@
       <w:pPr>
         <w:spacing w:after="100"/>
       </w:pPr>
-      <w:hyperlink w:history="1" r:id="rId49pjywpcnj2azvoxbdjos">
+      <w:hyperlink w:history="1" r:id="rId2gbkxrm_75bdiwezgvc7v">
         <w:r>
           <w:rPr>
             <w:rFonts w:ascii="Calibri" w:cs="Calibri" w:eastAsia="Calibri" w:hAnsi="Calibri"/>
@@ -1516,7 +1516,7 @@
       <w:pPr>
         <w:spacing w:after="100"/>
       </w:pPr>
-      <w:hyperlink w:history="1" r:id="rIduwm8o0hseyshqkrwm4vnu">
+      <w:hyperlink w:history="1" r:id="rIdfa4zy9ljuhw9rqzan9l75">
         <w:r>
           <w:rPr>
             <w:rFonts w:ascii="Calibri" w:cs="Calibri" w:eastAsia="Calibri" w:hAnsi="Calibri"/>
@@ -1696,7 +1696,7 @@
       <w:pPr>
         <w:spacing w:after="100"/>
       </w:pPr>
-      <w:hyperlink w:history="1" r:id="rId8mm5krdt1sqleu3ss31lo">
+      <w:hyperlink w:history="1" r:id="rIdknhbzwhryr8sbpf3suh2s">
         <w:r>
           <w:rPr>
             <w:rFonts w:ascii="Calibri" w:cs="Calibri" w:eastAsia="Calibri" w:hAnsi="Calibri"/>
@@ -1713,7 +1713,7 @@
       <w:pPr>
         <w:spacing w:after="100"/>
       </w:pPr>
-      <w:hyperlink w:history="1" r:id="rIdfkmwrwdcanxot0_nwnkjz">
+      <w:hyperlink w:history="1" r:id="rIdc0kajxjj4n2lhc38ohvcb">
         <w:r>
           <w:rPr>
             <w:rFonts w:ascii="Calibri" w:cs="Calibri" w:eastAsia="Calibri" w:hAnsi="Calibri"/>
@@ -1936,7 +1936,7 @@
       <w:pPr>
         <w:spacing w:after="100"/>
       </w:pPr>
-      <w:hyperlink w:history="1" r:id="rIdkdrikms1pvwuuwgn1-hp1">
+      <w:hyperlink w:history="1" r:id="rIdep8vr2jfprg28qvzhzpll">
         <w:r>
           <w:rPr>
             <w:rFonts w:ascii="Calibri" w:cs="Calibri" w:eastAsia="Calibri" w:hAnsi="Calibri"/>
@@ -2171,7 +2171,7 @@
       <w:pPr>
         <w:spacing w:after="100"/>
       </w:pPr>
-      <w:hyperlink w:history="1" r:id="rIdrkntzznql7fjmomex_lab">
+      <w:hyperlink w:history="1" r:id="rId14fmjenmd2gvrjfnxjkmt">
         <w:r>
           <w:rPr>
             <w:rFonts w:ascii="Calibri" w:cs="Calibri" w:eastAsia="Calibri" w:hAnsi="Calibri"/>
@@ -2188,7 +2188,7 @@
       <w:pPr>
         <w:spacing w:after="100"/>
       </w:pPr>
-      <w:hyperlink w:history="1" r:id="rIdx8kxcvyjdcgcmvgaqwcpp">
+      <w:hyperlink w:history="1" r:id="rIdvvvi2tju4nj0cljz8nseh">
         <w:r>
           <w:rPr>
             <w:rFonts w:ascii="Calibri" w:cs="Calibri" w:eastAsia="Calibri" w:hAnsi="Calibri"/>
@@ -2291,7 +2291,7 @@
       <w:pPr>
         <w:spacing w:after="100"/>
       </w:pPr>
-      <w:hyperlink w:history="1" r:id="rIdqquyfbz9ewxppbw0l1xlu">
+      <w:hyperlink w:history="1" r:id="rIdjvkc40no1fyejc5spzajf">
         <w:r>
           <w:rPr>
             <w:rFonts w:ascii="Calibri" w:cs="Calibri" w:eastAsia="Calibri" w:hAnsi="Calibri"/>
@@ -2327,7 +2327,7 @@
       <w:pPr>
         <w:spacing w:after="100"/>
       </w:pPr>
-      <w:hyperlink w:history="1" r:id="rIdjvm7zzoci2fd8jggjraed">
+      <w:hyperlink w:history="1" r:id="rId9vmexzakgtlw1jcvdrkv6">
         <w:r>
           <w:rPr>
             <w:rFonts w:ascii="Calibri" w:cs="Calibri" w:eastAsia="Calibri" w:hAnsi="Calibri"/>
@@ -2407,7 +2407,7 @@
       <w:pPr>
         <w:spacing w:after="100"/>
       </w:pPr>
-      <w:hyperlink w:history="1" r:id="rIdsic4jtop79hqnygh4jsol">
+      <w:hyperlink w:history="1" r:id="rIdwygiqigehrrh9afu1yyoo">
         <w:r>
           <w:rPr>
             <w:rFonts w:ascii="Calibri" w:cs="Calibri" w:eastAsia="Calibri" w:hAnsi="Calibri"/>
@@ -2592,7 +2592,7 @@
       <w:pPr>
         <w:spacing w:after="100"/>
       </w:pPr>
-      <w:hyperlink w:history="1" r:id="rIdq-vg-uzofrjyicwrmcau2">
+      <w:hyperlink w:history="1" r:id="rIdrlvhhpmjw22nggzguafpa">
         <w:r>
           <w:rPr>
             <w:rFonts w:ascii="Calibri" w:cs="Calibri" w:eastAsia="Calibri" w:hAnsi="Calibri"/>
@@ -2609,7 +2609,7 @@
       <w:pPr>
         <w:spacing w:after="100"/>
       </w:pPr>
-      <w:hyperlink w:history="1" r:id="rIdsf9gj07fobjoj4dcyblnx">
+      <w:hyperlink w:history="1" r:id="rIdlhsl5jkj-ngfffw3xxscw">
         <w:r>
           <w:rPr>
             <w:rFonts w:ascii="Calibri" w:cs="Calibri" w:eastAsia="Calibri" w:hAnsi="Calibri"/>
@@ -2878,7 +2878,7 @@
       <w:pPr>
         <w:spacing w:after="100"/>
       </w:pPr>
-      <w:hyperlink w:history="1" r:id="rIdhyrv_pcrpcqgzgvru_8gc">
+      <w:hyperlink w:history="1" r:id="rIdz75rhw2r14aogzrcoxvf6">
         <w:r>
           <w:rPr>
             <w:rFonts w:ascii="Calibri" w:cs="Calibri" w:eastAsia="Calibri" w:hAnsi="Calibri"/>
@@ -2895,7 +2895,7 @@
       <w:pPr>
         <w:spacing w:after="100"/>
       </w:pPr>
-      <w:hyperlink w:history="1" r:id="rIdiardo3b88dkj7iunjt-nn">
+      <w:hyperlink w:history="1" r:id="rIdgrzu2xmuu7nm-huhpe-ws">
         <w:r>
           <w:rPr>
             <w:rFonts w:ascii="Calibri" w:cs="Calibri" w:eastAsia="Calibri" w:hAnsi="Calibri"/>
@@ -3176,7 +3176,7 @@
       <w:pPr>
         <w:spacing w:after="100"/>
       </w:pPr>
-      <w:hyperlink w:history="1" r:id="rIdshbzjc7ugykwp1qgi_gfl">
+      <w:hyperlink w:history="1" r:id="rIdcdtdl8ny731w3vyrhhhgm">
         <w:r>
           <w:rPr>
             <w:rFonts w:ascii="Calibri" w:cs="Calibri" w:eastAsia="Calibri" w:hAnsi="Calibri"/>
@@ -3193,7 +3193,7 @@
       <w:pPr>
         <w:spacing w:after="100"/>
       </w:pPr>
-      <w:hyperlink w:history="1" r:id="rIdkk6ir0p0nm1ypg5tb5hpy">
+      <w:hyperlink w:history="1" r:id="rId0-fonkzzejuld8zgwq9ev">
         <w:r>
           <w:rPr>
             <w:rFonts w:ascii="Calibri" w:cs="Calibri" w:eastAsia="Calibri" w:hAnsi="Calibri"/>
@@ -3359,7 +3359,7 @@
       <w:pPr>
         <w:spacing w:after="100"/>
       </w:pPr>
-      <w:hyperlink w:history="1" r:id="rIdsntilvd18kw6mzlwpmtmt">
+      <w:hyperlink w:history="1" r:id="rIdocia5imek0nkwahpkzja3">
         <w:r>
           <w:rPr>
             <w:rFonts w:ascii="Calibri" w:cs="Calibri" w:eastAsia="Calibri" w:hAnsi="Calibri"/>
@@ -3544,7 +3544,7 @@
       <w:pPr>
         <w:spacing w:after="100"/>
       </w:pPr>
-      <w:hyperlink w:history="1" r:id="rId4evm5veafuv8lomwtnwbp">
+      <w:hyperlink w:history="1" r:id="rIdxs7afvsslhw9cv5wje8w9">
         <w:r>
           <w:rPr>
             <w:rFonts w:ascii="Calibri" w:cs="Calibri" w:eastAsia="Calibri" w:hAnsi="Calibri"/>
@@ -3599,7 +3599,7 @@
         </w:rPr>
         <w:t xml:space="preserve">Empresa de Acueducto y Alcantarillado de Bogotá E.S.P. (EAAB-ESP). (2026). Misión, visión, funciones y deberes institucionales. Recuperado el 23 de agosto de 2026, de </w:t>
       </w:r>
-      <w:hyperlink w:history="1" r:id="rIdcqizvtkgonc8nzantn2fr">
+      <w:hyperlink w:history="1" r:id="rIdu1felqr4zyvk6pfsrdhxm">
         <w:r>
           <w:rPr>
             <w:rFonts w:ascii="Calibri" w:cs="Calibri" w:eastAsia="Calibri" w:hAnsi="Calibri"/>
@@ -3654,7 +3654,7 @@
         </w:rPr>
         <w:t xml:space="preserve">Empresa de Acueducto y Alcantarillado de Bogotá E.S.P. (EAAB-ESP). (2026). Portal de Transparencia y Acceso a la Información Pública (Ley 1712 de 2014). Recuperado el 23 de agosto de 2026, de </w:t>
       </w:r>
-      <w:hyperlink w:history="1" r:id="rId3d9soidcz7sdnnesu6jbr">
+      <w:hyperlink w:history="1" r:id="rIdalt5rem1vrqvkotkcxsgg">
         <w:r>
           <w:rPr>
             <w:rFonts w:ascii="Calibri" w:cs="Calibri" w:eastAsia="Calibri" w:hAnsi="Calibri"/>
@@ -3709,7 +3709,7 @@
         </w:rPr>
         <w:t xml:space="preserve">Empresa de Acueducto y Alcantarillado de Bogotá E.S.P. (EAAB-ESP). (2026). Organigrama general de la entidad (Actualizado a 18 de agosto de 2026). Recuperado el 23 de agosto de 2026, de </w:t>
       </w:r>
-      <w:hyperlink w:history="1" r:id="rIdacqe7j3qt_godfxkclcyw">
+      <w:hyperlink w:history="1" r:id="rIdpnnkgo3sdyg2ggbch6jn4">
         <w:r>
           <w:rPr>
             <w:rFonts w:ascii="Calibri" w:cs="Calibri" w:eastAsia="Calibri" w:hAnsi="Calibri"/>
@@ -3764,7 +3764,7 @@
         </w:rPr>
         <w:t xml:space="preserve">Empresa de Acueducto y Alcantarillado de Bogotá E.S.P. (EAAB-ESP). (2026). Visión y misión empresarial. Recuperado el 23 de agosto de 2026, de </w:t>
       </w:r>
-      <w:hyperlink w:history="1" r:id="rId2gvc-dbeswk3f3le63bvg">
+      <w:hyperlink w:history="1" r:id="rIdzfbvw3pmdwu7erz1swn6u">
         <w:r>
           <w:rPr>
             <w:rFonts w:ascii="Calibri" w:cs="Calibri" w:eastAsia="Calibri" w:hAnsi="Calibri"/>
@@ -3819,7 +3819,7 @@
         </w:rPr>
         <w:t xml:space="preserve">Empresa de Acueducto y Alcantarillado de Bogotá E.S.P. (EAAB-ESP). (2026). Estructura orgánica y funciones. Recuperado el 23 de agosto de 2026, de </w:t>
       </w:r>
-      <w:hyperlink w:history="1" r:id="rIdm9dc0lkzmicqsf31uuezi">
+      <w:hyperlink w:history="1" r:id="rIduinwnzgjrfitue4whwvs9">
         <w:r>
           <w:rPr>
             <w:rFonts w:ascii="Calibri" w:cs="Calibri" w:eastAsia="Calibri" w:hAnsi="Calibri"/>
@@ -3874,7 +3874,7 @@
         </w:rPr>
         <w:t xml:space="preserve">Empresa de Acueducto y Alcantarillado de Bogotá E.S.P. (EAAB-ESP). (2026). Responsabilidad social empresarial y gestión ambiental. Recuperado el 23 de agosto de 2026, de </w:t>
       </w:r>
-      <w:hyperlink w:history="1" r:id="rIdoxcwg_xme4ii_lvk2a230">
+      <w:hyperlink w:history="1" r:id="rIdvdth0ohx3fblzgppxbfiy">
         <w:r>
           <w:rPr>
             <w:rFonts w:ascii="Calibri" w:cs="Calibri" w:eastAsia="Calibri" w:hAnsi="Calibri"/>
@@ -3929,7 +3929,7 @@
         </w:rPr>
         <w:t xml:space="preserve">Departamento Administrativo de la Función Pública. (2014). Ley 1712 de 2014 — Ley de Transparencia y del Derecho de Acceso a la Información Pública Nacional. Recuperado el 23 de agosto de 2026, de </w:t>
       </w:r>
-      <w:hyperlink w:history="1" r:id="rId6ijplteyeslwakwakahji">
+      <w:hyperlink w:history="1" r:id="rIdycrmqqcvjjhwefnl0mn2r">
         <w:r>
           <w:rPr>
             <w:rFonts w:ascii="Calibri" w:cs="Calibri" w:eastAsia="Calibri" w:hAnsi="Calibri"/>
@@ -3984,7 +3984,7 @@
         </w:rPr>
         <w:t xml:space="preserve">Departamento Administrativo de la Función Pública. (1994). Ley 142 de 1994 — Régimen de los Servicios Públicos Domiciliarios. Recuperado el 23 de agosto de 2026, de </w:t>
       </w:r>
-      <w:hyperlink w:history="1" r:id="rId-uv5qi3o5n0wno0pkulec">
+      <w:hyperlink w:history="1" r:id="rId9o32vp--qoznil6ruh2wq">
         <w:r>
           <w:rPr>
             <w:rFonts w:ascii="Calibri" w:cs="Calibri" w:eastAsia="Calibri" w:hAnsi="Calibri"/>
@@ -4039,7 +4039,7 @@
         </w:rPr>
         <w:t xml:space="preserve">Empresa de Acueducto y Alcantarillado de Bogotá E.S.P. (EAAB-ESP). (2026). Términos, condiciones y datos corporativos. Recuperado el 23 de agosto de 2026, de </w:t>
       </w:r>
-      <w:hyperlink w:history="1" r:id="rIdo3ib2kxoi3dxkslpuyenj">
+      <w:hyperlink w:history="1" r:id="rId3njwkcq7qdybeedzqfvhf">
         <w:r>
           <w:rPr>
             <w:rFonts w:ascii="Calibri" w:cs="Calibri" w:eastAsia="Calibri" w:hAnsi="Calibri"/>
@@ -4094,7 +4094,7 @@
         </w:rPr>
         <w:t xml:space="preserve">Empresa de Acueducto y Alcantarillado de Bogotá E.S.P. (EAAB-ESP). (2026). Planeación, presupuesto e informes financieros. Recuperado el 23 de agosto de 2026, de </w:t>
       </w:r>
-      <w:hyperlink w:history="1" r:id="rIdtdm8xfgaj1om1nk5jhggs">
+      <w:hyperlink w:history="1" r:id="rId8ajceiudfl1mjv3kokdty">
         <w:r>
           <w:rPr>
             <w:rFonts w:ascii="Calibri" w:cs="Calibri" w:eastAsia="Calibri" w:hAnsi="Calibri"/>
@@ -4149,7 +4149,7 @@
         </w:rPr>
         <w:t xml:space="preserve">Empresa de Acueducto y Alcantarillado de Bogotá E.S.P. (EAAB-ESP). (2026). Caracterización y diálogo con grupos de interés. Recuperado el 23 de agosto de 2026, de </w:t>
       </w:r>
-      <w:hyperlink w:history="1" r:id="rIdzrrkzaxl7v6i_-zw5tfhn">
+      <w:hyperlink w:history="1" r:id="rIdhfiuq5lerh6ppyznboak5">
         <w:r>
           <w:rPr>
             <w:rFonts w:ascii="Calibri" w:cs="Calibri" w:eastAsia="Calibri" w:hAnsi="Calibri"/>
@@ -4204,7 +4204,7 @@
         </w:rPr>
         <w:t xml:space="preserve">Empresa de Acueducto y Alcantarillado de Bogotá E.S.P. (EAAB-ESP). (2026). Mapas y cartas descriptivas de los procesos institucionales. Recuperado el 23 de agosto de 2026, de </w:t>
       </w:r>
-      <w:hyperlink w:history="1" r:id="rIdpy3ls5ytmtkskqzbeilpb">
+      <w:hyperlink w:history="1" r:id="rIdpqjdw2j07vwdga62tcoq8">
         <w:r>
           <w:rPr>
             <w:rFonts w:ascii="Calibri" w:cs="Calibri" w:eastAsia="Calibri" w:hAnsi="Calibri"/>

</xml_diff>

<commit_message>
Agregar scripts de diagnóstico y verificar estructura correcta del docx con logo
</commit_message>
<xml_diff>
--- a/public/exports/Bitacora_EAAB.docx
+++ b/public/exports/Bitacora_EAAB.docx
@@ -1178,7 +1178,7 @@
         </w:rPr>
         <w:t xml:space="preserve">Contacto Oficial: PBX (+57) 601 344 7000 · Línea de Atención 116 · Portal: </w:t>
       </w:r>
-      <w:hyperlink w:history="1" r:id="rIdaz-8zjtejd7kzfycurove">
+      <w:hyperlink w:history="1" r:id="rIdqjalfyvhqjw5mwuj_81rg">
         <w:r>
           <w:rPr>
             <w:rFonts w:ascii="Calibri" w:cs="Calibri" w:eastAsia="Calibri" w:hAnsi="Calibri"/>
@@ -1302,7 +1302,7 @@
       <w:pPr>
         <w:spacing w:after="100"/>
       </w:pPr>
-      <w:hyperlink w:history="1" r:id="rIdjcbdk2xupprin6g349esd">
+      <w:hyperlink w:history="1" r:id="rId4jm8aum3t0fqtsec2aylx">
         <w:r>
           <w:rPr>
             <w:rFonts w:ascii="Calibri" w:cs="Calibri" w:eastAsia="Calibri" w:hAnsi="Calibri"/>
@@ -1319,7 +1319,7 @@
       <w:pPr>
         <w:spacing w:after="100"/>
       </w:pPr>
-      <w:hyperlink w:history="1" r:id="rIduwhzf5sz6_tnguntry6qv">
+      <w:hyperlink w:history="1" r:id="rIdyr-jrfvhnknq5ajkjlph-">
         <w:r>
           <w:rPr>
             <w:rFonts w:ascii="Calibri" w:cs="Calibri" w:eastAsia="Calibri" w:hAnsi="Calibri"/>
@@ -1499,7 +1499,7 @@
       <w:pPr>
         <w:spacing w:after="100"/>
       </w:pPr>
-      <w:hyperlink w:history="1" r:id="rId2gbkxrm_75bdiwezgvc7v">
+      <w:hyperlink w:history="1" r:id="rIdbvglboiftcjiprk1hox-l">
         <w:r>
           <w:rPr>
             <w:rFonts w:ascii="Calibri" w:cs="Calibri" w:eastAsia="Calibri" w:hAnsi="Calibri"/>
@@ -1516,7 +1516,7 @@
       <w:pPr>
         <w:spacing w:after="100"/>
       </w:pPr>
-      <w:hyperlink w:history="1" r:id="rIdfa4zy9ljuhw9rqzan9l75">
+      <w:hyperlink w:history="1" r:id="rIdjgqfopopwdqbzvch4jo0q">
         <w:r>
           <w:rPr>
             <w:rFonts w:ascii="Calibri" w:cs="Calibri" w:eastAsia="Calibri" w:hAnsi="Calibri"/>
@@ -1696,7 +1696,7 @@
       <w:pPr>
         <w:spacing w:after="100"/>
       </w:pPr>
-      <w:hyperlink w:history="1" r:id="rIdknhbzwhryr8sbpf3suh2s">
+      <w:hyperlink w:history="1" r:id="rIdrokhhpoovjop1cqhqdgro">
         <w:r>
           <w:rPr>
             <w:rFonts w:ascii="Calibri" w:cs="Calibri" w:eastAsia="Calibri" w:hAnsi="Calibri"/>
@@ -1713,7 +1713,7 @@
       <w:pPr>
         <w:spacing w:after="100"/>
       </w:pPr>
-      <w:hyperlink w:history="1" r:id="rIdc0kajxjj4n2lhc38ohvcb">
+      <w:hyperlink w:history="1" r:id="rIda889co_nhbqwmdyz4pkbv">
         <w:r>
           <w:rPr>
             <w:rFonts w:ascii="Calibri" w:cs="Calibri" w:eastAsia="Calibri" w:hAnsi="Calibri"/>
@@ -1936,7 +1936,7 @@
       <w:pPr>
         <w:spacing w:after="100"/>
       </w:pPr>
-      <w:hyperlink w:history="1" r:id="rIdep8vr2jfprg28qvzhzpll">
+      <w:hyperlink w:history="1" r:id="rIddsrau-whrcrb8yebpovjv">
         <w:r>
           <w:rPr>
             <w:rFonts w:ascii="Calibri" w:cs="Calibri" w:eastAsia="Calibri" w:hAnsi="Calibri"/>
@@ -2171,7 +2171,7 @@
       <w:pPr>
         <w:spacing w:after="100"/>
       </w:pPr>
-      <w:hyperlink w:history="1" r:id="rId14fmjenmd2gvrjfnxjkmt">
+      <w:hyperlink w:history="1" r:id="rId_jb4k37rfzrvqpvu3vjap">
         <w:r>
           <w:rPr>
             <w:rFonts w:ascii="Calibri" w:cs="Calibri" w:eastAsia="Calibri" w:hAnsi="Calibri"/>
@@ -2188,7 +2188,7 @@
       <w:pPr>
         <w:spacing w:after="100"/>
       </w:pPr>
-      <w:hyperlink w:history="1" r:id="rIdvvvi2tju4nj0cljz8nseh">
+      <w:hyperlink w:history="1" r:id="rIdevz53fe8ofuvznq2c7f14">
         <w:r>
           <w:rPr>
             <w:rFonts w:ascii="Calibri" w:cs="Calibri" w:eastAsia="Calibri" w:hAnsi="Calibri"/>
@@ -2291,7 +2291,7 @@
       <w:pPr>
         <w:spacing w:after="100"/>
       </w:pPr>
-      <w:hyperlink w:history="1" r:id="rIdjvkc40no1fyejc5spzajf">
+      <w:hyperlink w:history="1" r:id="rIdsrvb3oz14w9idihs6vk4y">
         <w:r>
           <w:rPr>
             <w:rFonts w:ascii="Calibri" w:cs="Calibri" w:eastAsia="Calibri" w:hAnsi="Calibri"/>
@@ -2327,7 +2327,7 @@
       <w:pPr>
         <w:spacing w:after="100"/>
       </w:pPr>
-      <w:hyperlink w:history="1" r:id="rId9vmexzakgtlw1jcvdrkv6">
+      <w:hyperlink w:history="1" r:id="rId7u6y5vlstpsiuinrf_x8l">
         <w:r>
           <w:rPr>
             <w:rFonts w:ascii="Calibri" w:cs="Calibri" w:eastAsia="Calibri" w:hAnsi="Calibri"/>
@@ -2407,7 +2407,7 @@
       <w:pPr>
         <w:spacing w:after="100"/>
       </w:pPr>
-      <w:hyperlink w:history="1" r:id="rIdwygiqigehrrh9afu1yyoo">
+      <w:hyperlink w:history="1" r:id="rIdimyjd_gzfxw8_v4_ia-wm">
         <w:r>
           <w:rPr>
             <w:rFonts w:ascii="Calibri" w:cs="Calibri" w:eastAsia="Calibri" w:hAnsi="Calibri"/>
@@ -2592,7 +2592,7 @@
       <w:pPr>
         <w:spacing w:after="100"/>
       </w:pPr>
-      <w:hyperlink w:history="1" r:id="rIdrlvhhpmjw22nggzguafpa">
+      <w:hyperlink w:history="1" r:id="rIdye0hxlvoel53ntwokril7">
         <w:r>
           <w:rPr>
             <w:rFonts w:ascii="Calibri" w:cs="Calibri" w:eastAsia="Calibri" w:hAnsi="Calibri"/>
@@ -2609,7 +2609,7 @@
       <w:pPr>
         <w:spacing w:after="100"/>
       </w:pPr>
-      <w:hyperlink w:history="1" r:id="rIdlhsl5jkj-ngfffw3xxscw">
+      <w:hyperlink w:history="1" r:id="rIddfhnnopu3k1juwgaugex5">
         <w:r>
           <w:rPr>
             <w:rFonts w:ascii="Calibri" w:cs="Calibri" w:eastAsia="Calibri" w:hAnsi="Calibri"/>
@@ -2878,7 +2878,7 @@
       <w:pPr>
         <w:spacing w:after="100"/>
       </w:pPr>
-      <w:hyperlink w:history="1" r:id="rIdz75rhw2r14aogzrcoxvf6">
+      <w:hyperlink w:history="1" r:id="rId5rdvwaz5hcoqkirm_imbm">
         <w:r>
           <w:rPr>
             <w:rFonts w:ascii="Calibri" w:cs="Calibri" w:eastAsia="Calibri" w:hAnsi="Calibri"/>
@@ -2895,7 +2895,7 @@
       <w:pPr>
         <w:spacing w:after="100"/>
       </w:pPr>
-      <w:hyperlink w:history="1" r:id="rIdgrzu2xmuu7nm-huhpe-ws">
+      <w:hyperlink w:history="1" r:id="rId8qladug1gucypwgqcsr33">
         <w:r>
           <w:rPr>
             <w:rFonts w:ascii="Calibri" w:cs="Calibri" w:eastAsia="Calibri" w:hAnsi="Calibri"/>
@@ -3176,7 +3176,7 @@
       <w:pPr>
         <w:spacing w:after="100"/>
       </w:pPr>
-      <w:hyperlink w:history="1" r:id="rIdcdtdl8ny731w3vyrhhhgm">
+      <w:hyperlink w:history="1" r:id="rIdqpnnd_ed0x15gcpqddrvn">
         <w:r>
           <w:rPr>
             <w:rFonts w:ascii="Calibri" w:cs="Calibri" w:eastAsia="Calibri" w:hAnsi="Calibri"/>
@@ -3193,7 +3193,7 @@
       <w:pPr>
         <w:spacing w:after="100"/>
       </w:pPr>
-      <w:hyperlink w:history="1" r:id="rId0-fonkzzejuld8zgwq9ev">
+      <w:hyperlink w:history="1" r:id="rIdeapugqdgii19tmtkixn_j">
         <w:r>
           <w:rPr>
             <w:rFonts w:ascii="Calibri" w:cs="Calibri" w:eastAsia="Calibri" w:hAnsi="Calibri"/>
@@ -3359,7 +3359,7 @@
       <w:pPr>
         <w:spacing w:after="100"/>
       </w:pPr>
-      <w:hyperlink w:history="1" r:id="rIdocia5imek0nkwahpkzja3">
+      <w:hyperlink w:history="1" r:id="rIdhgx_hxorvcaon7uhj1g9u">
         <w:r>
           <w:rPr>
             <w:rFonts w:ascii="Calibri" w:cs="Calibri" w:eastAsia="Calibri" w:hAnsi="Calibri"/>
@@ -3544,7 +3544,7 @@
       <w:pPr>
         <w:spacing w:after="100"/>
       </w:pPr>
-      <w:hyperlink w:history="1" r:id="rIdxs7afvsslhw9cv5wje8w9">
+      <w:hyperlink w:history="1" r:id="rId5nvs_1bkz8qhcnsyy_ebs">
         <w:r>
           <w:rPr>
             <w:rFonts w:ascii="Calibri" w:cs="Calibri" w:eastAsia="Calibri" w:hAnsi="Calibri"/>
@@ -3599,7 +3599,7 @@
         </w:rPr>
         <w:t xml:space="preserve">Empresa de Acueducto y Alcantarillado de Bogotá E.S.P. (EAAB-ESP). (2026). Misión, visión, funciones y deberes institucionales. Recuperado el 23 de agosto de 2026, de </w:t>
       </w:r>
-      <w:hyperlink w:history="1" r:id="rIdu1felqr4zyvk6pfsrdhxm">
+      <w:hyperlink w:history="1" r:id="rIdiv9ngcwd0gujncco1k82_">
         <w:r>
           <w:rPr>
             <w:rFonts w:ascii="Calibri" w:cs="Calibri" w:eastAsia="Calibri" w:hAnsi="Calibri"/>
@@ -3654,7 +3654,7 @@
         </w:rPr>
         <w:t xml:space="preserve">Empresa de Acueducto y Alcantarillado de Bogotá E.S.P. (EAAB-ESP). (2026). Portal de Transparencia y Acceso a la Información Pública (Ley 1712 de 2014). Recuperado el 23 de agosto de 2026, de </w:t>
       </w:r>
-      <w:hyperlink w:history="1" r:id="rIdalt5rem1vrqvkotkcxsgg">
+      <w:hyperlink w:history="1" r:id="rIdfsjekkhwtla3kvvj9esaq">
         <w:r>
           <w:rPr>
             <w:rFonts w:ascii="Calibri" w:cs="Calibri" w:eastAsia="Calibri" w:hAnsi="Calibri"/>
@@ -3709,7 +3709,7 @@
         </w:rPr>
         <w:t xml:space="preserve">Empresa de Acueducto y Alcantarillado de Bogotá E.S.P. (EAAB-ESP). (2026). Organigrama general de la entidad (Actualizado a 18 de agosto de 2026). Recuperado el 23 de agosto de 2026, de </w:t>
       </w:r>
-      <w:hyperlink w:history="1" r:id="rIdpnnkgo3sdyg2ggbch6jn4">
+      <w:hyperlink w:history="1" r:id="rIdgaozgq5-zzd74jgnx61hj">
         <w:r>
           <w:rPr>
             <w:rFonts w:ascii="Calibri" w:cs="Calibri" w:eastAsia="Calibri" w:hAnsi="Calibri"/>
@@ -3764,7 +3764,7 @@
         </w:rPr>
         <w:t xml:space="preserve">Empresa de Acueducto y Alcantarillado de Bogotá E.S.P. (EAAB-ESP). (2026). Visión y misión empresarial. Recuperado el 23 de agosto de 2026, de </w:t>
       </w:r>
-      <w:hyperlink w:history="1" r:id="rIdzfbvw3pmdwu7erz1swn6u">
+      <w:hyperlink w:history="1" r:id="rIdy8c31b8lsrmg_qusdwedk">
         <w:r>
           <w:rPr>
             <w:rFonts w:ascii="Calibri" w:cs="Calibri" w:eastAsia="Calibri" w:hAnsi="Calibri"/>
@@ -3819,7 +3819,7 @@
         </w:rPr>
         <w:t xml:space="preserve">Empresa de Acueducto y Alcantarillado de Bogotá E.S.P. (EAAB-ESP). (2026). Estructura orgánica y funciones. Recuperado el 23 de agosto de 2026, de </w:t>
       </w:r>
-      <w:hyperlink w:history="1" r:id="rIduinwnzgjrfitue4whwvs9">
+      <w:hyperlink w:history="1" r:id="rIdryubo3tq2lkqcyvu0yx6h">
         <w:r>
           <w:rPr>
             <w:rFonts w:ascii="Calibri" w:cs="Calibri" w:eastAsia="Calibri" w:hAnsi="Calibri"/>
@@ -3874,7 +3874,7 @@
         </w:rPr>
         <w:t xml:space="preserve">Empresa de Acueducto y Alcantarillado de Bogotá E.S.P. (EAAB-ESP). (2026). Responsabilidad social empresarial y gestión ambiental. Recuperado el 23 de agosto de 2026, de </w:t>
       </w:r>
-      <w:hyperlink w:history="1" r:id="rIdvdth0ohx3fblzgppxbfiy">
+      <w:hyperlink w:history="1" r:id="rIdbacuza7r2ext7wkc8-loa">
         <w:r>
           <w:rPr>
             <w:rFonts w:ascii="Calibri" w:cs="Calibri" w:eastAsia="Calibri" w:hAnsi="Calibri"/>
@@ -3929,7 +3929,7 @@
         </w:rPr>
         <w:t xml:space="preserve">Departamento Administrativo de la Función Pública. (2014). Ley 1712 de 2014 — Ley de Transparencia y del Derecho de Acceso a la Información Pública Nacional. Recuperado el 23 de agosto de 2026, de </w:t>
       </w:r>
-      <w:hyperlink w:history="1" r:id="rIdycrmqqcvjjhwefnl0mn2r">
+      <w:hyperlink w:history="1" r:id="rIdm8kq6irla5ciqqoj_hfkt">
         <w:r>
           <w:rPr>
             <w:rFonts w:ascii="Calibri" w:cs="Calibri" w:eastAsia="Calibri" w:hAnsi="Calibri"/>
@@ -3984,7 +3984,7 @@
         </w:rPr>
         <w:t xml:space="preserve">Departamento Administrativo de la Función Pública. (1994). Ley 142 de 1994 — Régimen de los Servicios Públicos Domiciliarios. Recuperado el 23 de agosto de 2026, de </w:t>
       </w:r>
-      <w:hyperlink w:history="1" r:id="rId9o32vp--qoznil6ruh2wq">
+      <w:hyperlink w:history="1" r:id="rIdj22bbl2rads3fjokysjpr">
         <w:r>
           <w:rPr>
             <w:rFonts w:ascii="Calibri" w:cs="Calibri" w:eastAsia="Calibri" w:hAnsi="Calibri"/>
@@ -4039,7 +4039,7 @@
         </w:rPr>
         <w:t xml:space="preserve">Empresa de Acueducto y Alcantarillado de Bogotá E.S.P. (EAAB-ESP). (2026). Términos, condiciones y datos corporativos. Recuperado el 23 de agosto de 2026, de </w:t>
       </w:r>
-      <w:hyperlink w:history="1" r:id="rId3njwkcq7qdybeedzqfvhf">
+      <w:hyperlink w:history="1" r:id="rId0-fg7dapbxiy7h11ebsrt">
         <w:r>
           <w:rPr>
             <w:rFonts w:ascii="Calibri" w:cs="Calibri" w:eastAsia="Calibri" w:hAnsi="Calibri"/>
@@ -4094,7 +4094,7 @@
         </w:rPr>
         <w:t xml:space="preserve">Empresa de Acueducto y Alcantarillado de Bogotá E.S.P. (EAAB-ESP). (2026). Planeación, presupuesto e informes financieros. Recuperado el 23 de agosto de 2026, de </w:t>
       </w:r>
-      <w:hyperlink w:history="1" r:id="rId8ajceiudfl1mjv3kokdty">
+      <w:hyperlink w:history="1" r:id="rIdd46uns1hlzud_w5rqbpt2">
         <w:r>
           <w:rPr>
             <w:rFonts w:ascii="Calibri" w:cs="Calibri" w:eastAsia="Calibri" w:hAnsi="Calibri"/>
@@ -4149,7 +4149,7 @@
         </w:rPr>
         <w:t xml:space="preserve">Empresa de Acueducto y Alcantarillado de Bogotá E.S.P. (EAAB-ESP). (2026). Caracterización y diálogo con grupos de interés. Recuperado el 23 de agosto de 2026, de </w:t>
       </w:r>
-      <w:hyperlink w:history="1" r:id="rIdhfiuq5lerh6ppyznboak5">
+      <w:hyperlink w:history="1" r:id="rIdujxsyst5upoybwyuslypk">
         <w:r>
           <w:rPr>
             <w:rFonts w:ascii="Calibri" w:cs="Calibri" w:eastAsia="Calibri" w:hAnsi="Calibri"/>
@@ -4204,7 +4204,7 @@
         </w:rPr>
         <w:t xml:space="preserve">Empresa de Acueducto y Alcantarillado de Bogotá E.S.P. (EAAB-ESP). (2026). Mapas y cartas descriptivas de los procesos institucionales. Recuperado el 23 de agosto de 2026, de </w:t>
       </w:r>
-      <w:hyperlink w:history="1" r:id="rIdpqjdw2j07vwdga62tcoq8">
+      <w:hyperlink w:history="1" r:id="rIdibaeta1s_1zokdaninbkn">
         <w:r>
           <w:rPr>
             <w:rFonts w:ascii="Calibri" w:cs="Calibri" w:eastAsia="Calibri" w:hAnsi="Calibri"/>

</xml_diff>

<commit_message>
Portada en sección separada sin header/footer — logo, estudiantes, docente, asignatura, pie institucional en página 1 limpia
</commit_message>
<xml_diff>
--- a/public/exports/Bitacora_EAAB.docx
+++ b/public/exports/Bitacora_EAAB.docx
@@ -266,6 +266,34 @@
     <w:p>
       <w:r>
         <w:br w:type="page"/>
+      </w:r>
+    </w:p>
+    <w:p>
+      <w:pPr>
+        <w:sectPr>
+          <w:pgSz w:w="11906" w:h="16838" w:orient="portrait"/>
+          <w:pgMar w:top="1150" w:right="1150" w:bottom="1150" w:left="1150" w:header="708" w:footer="708" w:gutter="0"/>
+          <w:pgNumType/>
+          <w:titlePg/>
+          <w:docGrid w:linePitch="360"/>
+        </w:sectPr>
+      </w:pPr>
+    </w:p>
+    <w:p>
+      <w:pPr>
+        <w:spacing w:after="180" w:before="100"/>
+        <w:jc w:val="center"/>
+      </w:pPr>
+      <w:r>
+        <w:rPr>
+          <w:rFonts w:ascii="Calibri" w:cs="Calibri" w:eastAsia="Calibri" w:hAnsi="Calibri"/>
+          <w:b/>
+          <w:bCs/>
+          <w:color w:val="0F4C81"/>
+          <w:sz w:val="24"/>
+          <w:szCs w:val="24"/>
+        </w:rPr>
+        <w:t xml:space="preserve">Empresa de Acueducto y Alcantarillado de Bogotá E.S.P. (EAAB-ESP)</w:t>
       </w:r>
     </w:p>
     <w:p>
@@ -1178,7 +1206,7 @@
         </w:rPr>
         <w:t xml:space="preserve">Contacto Oficial: PBX (+57) 601 344 7000 · Línea de Atención 116 · Portal: </w:t>
       </w:r>
-      <w:hyperlink w:history="1" r:id="rIdqjalfyvhqjw5mwuj_81rg">
+      <w:hyperlink w:history="1" r:id="rIdlmm7_ldiz_lcofboptqlb">
         <w:r>
           <w:rPr>
             <w:rFonts w:ascii="Calibri" w:cs="Calibri" w:eastAsia="Calibri" w:hAnsi="Calibri"/>
@@ -1302,7 +1330,7 @@
       <w:pPr>
         <w:spacing w:after="100"/>
       </w:pPr>
-      <w:hyperlink w:history="1" r:id="rId4jm8aum3t0fqtsec2aylx">
+      <w:hyperlink w:history="1" r:id="rIdcvsleqwfsgpkbs2twjl-a">
         <w:r>
           <w:rPr>
             <w:rFonts w:ascii="Calibri" w:cs="Calibri" w:eastAsia="Calibri" w:hAnsi="Calibri"/>
@@ -1319,7 +1347,7 @@
       <w:pPr>
         <w:spacing w:after="100"/>
       </w:pPr>
-      <w:hyperlink w:history="1" r:id="rIdyr-jrfvhnknq5ajkjlph-">
+      <w:hyperlink w:history="1" r:id="rId__iiprt3kgcnttxwdn4rr">
         <w:r>
           <w:rPr>
             <w:rFonts w:ascii="Calibri" w:cs="Calibri" w:eastAsia="Calibri" w:hAnsi="Calibri"/>
@@ -1499,7 +1527,7 @@
       <w:pPr>
         <w:spacing w:after="100"/>
       </w:pPr>
-      <w:hyperlink w:history="1" r:id="rIdbvglboiftcjiprk1hox-l">
+      <w:hyperlink w:history="1" r:id="rIdx8b_ca3gmdlp6t7edraai">
         <w:r>
           <w:rPr>
             <w:rFonts w:ascii="Calibri" w:cs="Calibri" w:eastAsia="Calibri" w:hAnsi="Calibri"/>
@@ -1516,7 +1544,7 @@
       <w:pPr>
         <w:spacing w:after="100"/>
       </w:pPr>
-      <w:hyperlink w:history="1" r:id="rIdjgqfopopwdqbzvch4jo0q">
+      <w:hyperlink w:history="1" r:id="rIdmtksnybg9bsawogrppcmm">
         <w:r>
           <w:rPr>
             <w:rFonts w:ascii="Calibri" w:cs="Calibri" w:eastAsia="Calibri" w:hAnsi="Calibri"/>
@@ -1696,7 +1724,7 @@
       <w:pPr>
         <w:spacing w:after="100"/>
       </w:pPr>
-      <w:hyperlink w:history="1" r:id="rIdrokhhpoovjop1cqhqdgro">
+      <w:hyperlink w:history="1" r:id="rIdnwkfj93jgldy_vbdjsnsv">
         <w:r>
           <w:rPr>
             <w:rFonts w:ascii="Calibri" w:cs="Calibri" w:eastAsia="Calibri" w:hAnsi="Calibri"/>
@@ -1713,7 +1741,7 @@
       <w:pPr>
         <w:spacing w:after="100"/>
       </w:pPr>
-      <w:hyperlink w:history="1" r:id="rIda889co_nhbqwmdyz4pkbv">
+      <w:hyperlink w:history="1" r:id="rIdsuqzvtsplu-gfbn0l87ff">
         <w:r>
           <w:rPr>
             <w:rFonts w:ascii="Calibri" w:cs="Calibri" w:eastAsia="Calibri" w:hAnsi="Calibri"/>
@@ -1936,7 +1964,7 @@
       <w:pPr>
         <w:spacing w:after="100"/>
       </w:pPr>
-      <w:hyperlink w:history="1" r:id="rIddsrau-whrcrb8yebpovjv">
+      <w:hyperlink w:history="1" r:id="rIdx-kw9x-lq1jzm-wk5ic03">
         <w:r>
           <w:rPr>
             <w:rFonts w:ascii="Calibri" w:cs="Calibri" w:eastAsia="Calibri" w:hAnsi="Calibri"/>
@@ -2171,7 +2199,7 @@
       <w:pPr>
         <w:spacing w:after="100"/>
       </w:pPr>
-      <w:hyperlink w:history="1" r:id="rId_jb4k37rfzrvqpvu3vjap">
+      <w:hyperlink w:history="1" r:id="rIds8gbyswqy5ndmy9qz5m6o">
         <w:r>
           <w:rPr>
             <w:rFonts w:ascii="Calibri" w:cs="Calibri" w:eastAsia="Calibri" w:hAnsi="Calibri"/>
@@ -2188,7 +2216,7 @@
       <w:pPr>
         <w:spacing w:after="100"/>
       </w:pPr>
-      <w:hyperlink w:history="1" r:id="rIdevz53fe8ofuvznq2c7f14">
+      <w:hyperlink w:history="1" r:id="rIdfscpzoif_iettldp_bjpc">
         <w:r>
           <w:rPr>
             <w:rFonts w:ascii="Calibri" w:cs="Calibri" w:eastAsia="Calibri" w:hAnsi="Calibri"/>
@@ -2291,7 +2319,7 @@
       <w:pPr>
         <w:spacing w:after="100"/>
       </w:pPr>
-      <w:hyperlink w:history="1" r:id="rIdsrvb3oz14w9idihs6vk4y">
+      <w:hyperlink w:history="1" r:id="rIdhebc8bqeznoxswgriopli">
         <w:r>
           <w:rPr>
             <w:rFonts w:ascii="Calibri" w:cs="Calibri" w:eastAsia="Calibri" w:hAnsi="Calibri"/>
@@ -2327,7 +2355,7 @@
       <w:pPr>
         <w:spacing w:after="100"/>
       </w:pPr>
-      <w:hyperlink w:history="1" r:id="rId7u6y5vlstpsiuinrf_x8l">
+      <w:hyperlink w:history="1" r:id="rIddxlddfpgp2xpxqu4jcfos">
         <w:r>
           <w:rPr>
             <w:rFonts w:ascii="Calibri" w:cs="Calibri" w:eastAsia="Calibri" w:hAnsi="Calibri"/>
@@ -2407,7 +2435,7 @@
       <w:pPr>
         <w:spacing w:after="100"/>
       </w:pPr>
-      <w:hyperlink w:history="1" r:id="rIdimyjd_gzfxw8_v4_ia-wm">
+      <w:hyperlink w:history="1" r:id="rIdi1ecrji2mzufsf44xpxo-">
         <w:r>
           <w:rPr>
             <w:rFonts w:ascii="Calibri" w:cs="Calibri" w:eastAsia="Calibri" w:hAnsi="Calibri"/>
@@ -2592,7 +2620,7 @@
       <w:pPr>
         <w:spacing w:after="100"/>
       </w:pPr>
-      <w:hyperlink w:history="1" r:id="rIdye0hxlvoel53ntwokril7">
+      <w:hyperlink w:history="1" r:id="rIdiessp2ixp4wv71g3t_xwx">
         <w:r>
           <w:rPr>
             <w:rFonts w:ascii="Calibri" w:cs="Calibri" w:eastAsia="Calibri" w:hAnsi="Calibri"/>
@@ -2609,7 +2637,7 @@
       <w:pPr>
         <w:spacing w:after="100"/>
       </w:pPr>
-      <w:hyperlink w:history="1" r:id="rIddfhnnopu3k1juwgaugex5">
+      <w:hyperlink w:history="1" r:id="rIdp-xzt3w6r7korn_umokwo">
         <w:r>
           <w:rPr>
             <w:rFonts w:ascii="Calibri" w:cs="Calibri" w:eastAsia="Calibri" w:hAnsi="Calibri"/>
@@ -2878,7 +2906,7 @@
       <w:pPr>
         <w:spacing w:after="100"/>
       </w:pPr>
-      <w:hyperlink w:history="1" r:id="rId5rdvwaz5hcoqkirm_imbm">
+      <w:hyperlink w:history="1" r:id="rIdl2hz_0zwnuariy9x7uvkl">
         <w:r>
           <w:rPr>
             <w:rFonts w:ascii="Calibri" w:cs="Calibri" w:eastAsia="Calibri" w:hAnsi="Calibri"/>
@@ -2895,7 +2923,7 @@
       <w:pPr>
         <w:spacing w:after="100"/>
       </w:pPr>
-      <w:hyperlink w:history="1" r:id="rId8qladug1gucypwgqcsr33">
+      <w:hyperlink w:history="1" r:id="rIdukpzpchnmqefqeya_sit8">
         <w:r>
           <w:rPr>
             <w:rFonts w:ascii="Calibri" w:cs="Calibri" w:eastAsia="Calibri" w:hAnsi="Calibri"/>
@@ -3176,7 +3204,7 @@
       <w:pPr>
         <w:spacing w:after="100"/>
       </w:pPr>
-      <w:hyperlink w:history="1" r:id="rIdqpnnd_ed0x15gcpqddrvn">
+      <w:hyperlink w:history="1" r:id="rIdlh_lsha4vjbhagfd7zcr9">
         <w:r>
           <w:rPr>
             <w:rFonts w:ascii="Calibri" w:cs="Calibri" w:eastAsia="Calibri" w:hAnsi="Calibri"/>
@@ -3193,7 +3221,7 @@
       <w:pPr>
         <w:spacing w:after="100"/>
       </w:pPr>
-      <w:hyperlink w:history="1" r:id="rIdeapugqdgii19tmtkixn_j">
+      <w:hyperlink w:history="1" r:id="rIdslymtqwx2c39zcrxo_ftj">
         <w:r>
           <w:rPr>
             <w:rFonts w:ascii="Calibri" w:cs="Calibri" w:eastAsia="Calibri" w:hAnsi="Calibri"/>
@@ -3359,7 +3387,7 @@
       <w:pPr>
         <w:spacing w:after="100"/>
       </w:pPr>
-      <w:hyperlink w:history="1" r:id="rIdhgx_hxorvcaon7uhj1g9u">
+      <w:hyperlink w:history="1" r:id="rIdb7q87pgjgq6j2s7eltpnn">
         <w:r>
           <w:rPr>
             <w:rFonts w:ascii="Calibri" w:cs="Calibri" w:eastAsia="Calibri" w:hAnsi="Calibri"/>
@@ -3544,7 +3572,7 @@
       <w:pPr>
         <w:spacing w:after="100"/>
       </w:pPr>
-      <w:hyperlink w:history="1" r:id="rId5nvs_1bkz8qhcnsyy_ebs">
+      <w:hyperlink w:history="1" r:id="rId6ysrcnjbxjxc4c7cwc_yz">
         <w:r>
           <w:rPr>
             <w:rFonts w:ascii="Calibri" w:cs="Calibri" w:eastAsia="Calibri" w:hAnsi="Calibri"/>
@@ -3599,7 +3627,7 @@
         </w:rPr>
         <w:t xml:space="preserve">Empresa de Acueducto y Alcantarillado de Bogotá E.S.P. (EAAB-ESP). (2026). Misión, visión, funciones y deberes institucionales. Recuperado el 23 de agosto de 2026, de </w:t>
       </w:r>
-      <w:hyperlink w:history="1" r:id="rIdiv9ngcwd0gujncco1k82_">
+      <w:hyperlink w:history="1" r:id="rId6a7pdtswd8iizbf_dyuef">
         <w:r>
           <w:rPr>
             <w:rFonts w:ascii="Calibri" w:cs="Calibri" w:eastAsia="Calibri" w:hAnsi="Calibri"/>
@@ -3654,7 +3682,7 @@
         </w:rPr>
         <w:t xml:space="preserve">Empresa de Acueducto y Alcantarillado de Bogotá E.S.P. (EAAB-ESP). (2026). Portal de Transparencia y Acceso a la Información Pública (Ley 1712 de 2014). Recuperado el 23 de agosto de 2026, de </w:t>
       </w:r>
-      <w:hyperlink w:history="1" r:id="rIdfsjekkhwtla3kvvj9esaq">
+      <w:hyperlink w:history="1" r:id="rIdngchfrnisxuejrouwbj18">
         <w:r>
           <w:rPr>
             <w:rFonts w:ascii="Calibri" w:cs="Calibri" w:eastAsia="Calibri" w:hAnsi="Calibri"/>
@@ -3709,7 +3737,7 @@
         </w:rPr>
         <w:t xml:space="preserve">Empresa de Acueducto y Alcantarillado de Bogotá E.S.P. (EAAB-ESP). (2026). Organigrama general de la entidad (Actualizado a 18 de agosto de 2026). Recuperado el 23 de agosto de 2026, de </w:t>
       </w:r>
-      <w:hyperlink w:history="1" r:id="rIdgaozgq5-zzd74jgnx61hj">
+      <w:hyperlink w:history="1" r:id="rIdosp80omg-od3kc3rxinya">
         <w:r>
           <w:rPr>
             <w:rFonts w:ascii="Calibri" w:cs="Calibri" w:eastAsia="Calibri" w:hAnsi="Calibri"/>
@@ -3764,7 +3792,7 @@
         </w:rPr>
         <w:t xml:space="preserve">Empresa de Acueducto y Alcantarillado de Bogotá E.S.P. (EAAB-ESP). (2026). Visión y misión empresarial. Recuperado el 23 de agosto de 2026, de </w:t>
       </w:r>
-      <w:hyperlink w:history="1" r:id="rIdy8c31b8lsrmg_qusdwedk">
+      <w:hyperlink w:history="1" r:id="rIdu_ltygebtuwqyllu2dejm">
         <w:r>
           <w:rPr>
             <w:rFonts w:ascii="Calibri" w:cs="Calibri" w:eastAsia="Calibri" w:hAnsi="Calibri"/>
@@ -3819,7 +3847,7 @@
         </w:rPr>
         <w:t xml:space="preserve">Empresa de Acueducto y Alcantarillado de Bogotá E.S.P. (EAAB-ESP). (2026). Estructura orgánica y funciones. Recuperado el 23 de agosto de 2026, de </w:t>
       </w:r>
-      <w:hyperlink w:history="1" r:id="rIdryubo3tq2lkqcyvu0yx6h">
+      <w:hyperlink w:history="1" r:id="rIdx3zlqmhqyhbwuvdfxybfq">
         <w:r>
           <w:rPr>
             <w:rFonts w:ascii="Calibri" w:cs="Calibri" w:eastAsia="Calibri" w:hAnsi="Calibri"/>
@@ -3874,7 +3902,7 @@
         </w:rPr>
         <w:t xml:space="preserve">Empresa de Acueducto y Alcantarillado de Bogotá E.S.P. (EAAB-ESP). (2026). Responsabilidad social empresarial y gestión ambiental. Recuperado el 23 de agosto de 2026, de </w:t>
       </w:r>
-      <w:hyperlink w:history="1" r:id="rIdbacuza7r2ext7wkc8-loa">
+      <w:hyperlink w:history="1" r:id="rIdot7okss-lfkibnzrzoaon">
         <w:r>
           <w:rPr>
             <w:rFonts w:ascii="Calibri" w:cs="Calibri" w:eastAsia="Calibri" w:hAnsi="Calibri"/>
@@ -3929,7 +3957,7 @@
         </w:rPr>
         <w:t xml:space="preserve">Departamento Administrativo de la Función Pública. (2014). Ley 1712 de 2014 — Ley de Transparencia y del Derecho de Acceso a la Información Pública Nacional. Recuperado el 23 de agosto de 2026, de </w:t>
       </w:r>
-      <w:hyperlink w:history="1" r:id="rIdm8kq6irla5ciqqoj_hfkt">
+      <w:hyperlink w:history="1" r:id="rId3oipvaiwc99i2fjrfgf1h">
         <w:r>
           <w:rPr>
             <w:rFonts w:ascii="Calibri" w:cs="Calibri" w:eastAsia="Calibri" w:hAnsi="Calibri"/>
@@ -3984,7 +4012,7 @@
         </w:rPr>
         <w:t xml:space="preserve">Departamento Administrativo de la Función Pública. (1994). Ley 142 de 1994 — Régimen de los Servicios Públicos Domiciliarios. Recuperado el 23 de agosto de 2026, de </w:t>
       </w:r>
-      <w:hyperlink w:history="1" r:id="rIdj22bbl2rads3fjokysjpr">
+      <w:hyperlink w:history="1" r:id="rIdtlvxymvkh8zvioxqwadmk">
         <w:r>
           <w:rPr>
             <w:rFonts w:ascii="Calibri" w:cs="Calibri" w:eastAsia="Calibri" w:hAnsi="Calibri"/>
@@ -4039,7 +4067,7 @@
         </w:rPr>
         <w:t xml:space="preserve">Empresa de Acueducto y Alcantarillado de Bogotá E.S.P. (EAAB-ESP). (2026). Términos, condiciones y datos corporativos. Recuperado el 23 de agosto de 2026, de </w:t>
       </w:r>
-      <w:hyperlink w:history="1" r:id="rId0-fg7dapbxiy7h11ebsrt">
+      <w:hyperlink w:history="1" r:id="rIdmqcycrbzr09qugw8hyf5j">
         <w:r>
           <w:rPr>
             <w:rFonts w:ascii="Calibri" w:cs="Calibri" w:eastAsia="Calibri" w:hAnsi="Calibri"/>
@@ -4094,7 +4122,7 @@
         </w:rPr>
         <w:t xml:space="preserve">Empresa de Acueducto y Alcantarillado de Bogotá E.S.P. (EAAB-ESP). (2026). Planeación, presupuesto e informes financieros. Recuperado el 23 de agosto de 2026, de </w:t>
       </w:r>
-      <w:hyperlink w:history="1" r:id="rIdd46uns1hlzud_w5rqbpt2">
+      <w:hyperlink w:history="1" r:id="rId8qm9q-wmtd6r-p7asstaw">
         <w:r>
           <w:rPr>
             <w:rFonts w:ascii="Calibri" w:cs="Calibri" w:eastAsia="Calibri" w:hAnsi="Calibri"/>
@@ -4149,7 +4177,7 @@
         </w:rPr>
         <w:t xml:space="preserve">Empresa de Acueducto y Alcantarillado de Bogotá E.S.P. (EAAB-ESP). (2026). Caracterización y diálogo con grupos de interés. Recuperado el 23 de agosto de 2026, de </w:t>
       </w:r>
-      <w:hyperlink w:history="1" r:id="rIdujxsyst5upoybwyuslypk">
+      <w:hyperlink w:history="1" r:id="rIdsyvhkvzy4heljce45uohv">
         <w:r>
           <w:rPr>
             <w:rFonts w:ascii="Calibri" w:cs="Calibri" w:eastAsia="Calibri" w:hAnsi="Calibri"/>
@@ -4204,7 +4232,7 @@
         </w:rPr>
         <w:t xml:space="preserve">Empresa de Acueducto y Alcantarillado de Bogotá E.S.P. (EAAB-ESP). (2026). Mapas y cartas descriptivas de los procesos institucionales. Recuperado el 23 de agosto de 2026, de </w:t>
       </w:r>
-      <w:hyperlink w:history="1" r:id="rIdibaeta1s_1zokdaninbkn">
+      <w:hyperlink w:history="1" r:id="rIdgj9fnnhvdrayuror5c36z">
         <w:r>
           <w:rPr>
             <w:rFonts w:ascii="Calibri" w:cs="Calibri" w:eastAsia="Calibri" w:hAnsi="Calibri"/>

</xml_diff>

<commit_message>
Normalizar portada institucional oficial (docente, asignatura, CUL, ciudad) y validar generación de Word
</commit_message>
<xml_diff>
--- a/public/exports/Bitacora_EAAB.docx
+++ b/public/exports/Bitacora_EAAB.docx
@@ -1206,7 +1206,7 @@
         </w:rPr>
         <w:t xml:space="preserve">Contacto Oficial: PBX (+57) 601 344 7000 · Línea de Atención 116 · Portal: </w:t>
       </w:r>
-      <w:hyperlink w:history="1" r:id="rIdlmm7_ldiz_lcofboptqlb">
+      <w:hyperlink w:history="1" r:id="rIdgyz46c-slbk4n4jqxx1ab">
         <w:r>
           <w:rPr>
             <w:rFonts w:ascii="Calibri" w:cs="Calibri" w:eastAsia="Calibri" w:hAnsi="Calibri"/>
@@ -1330,7 +1330,7 @@
       <w:pPr>
         <w:spacing w:after="100"/>
       </w:pPr>
-      <w:hyperlink w:history="1" r:id="rIdcvsleqwfsgpkbs2twjl-a">
+      <w:hyperlink w:history="1" r:id="rIdk5t-fb0irkt2c5p3wxhtl">
         <w:r>
           <w:rPr>
             <w:rFonts w:ascii="Calibri" w:cs="Calibri" w:eastAsia="Calibri" w:hAnsi="Calibri"/>
@@ -1347,7 +1347,7 @@
       <w:pPr>
         <w:spacing w:after="100"/>
       </w:pPr>
-      <w:hyperlink w:history="1" r:id="rId__iiprt3kgcnttxwdn4rr">
+      <w:hyperlink w:history="1" r:id="rIdosq_fdrw_qicwe6kslqub">
         <w:r>
           <w:rPr>
             <w:rFonts w:ascii="Calibri" w:cs="Calibri" w:eastAsia="Calibri" w:hAnsi="Calibri"/>
@@ -1527,7 +1527,7 @@
       <w:pPr>
         <w:spacing w:after="100"/>
       </w:pPr>
-      <w:hyperlink w:history="1" r:id="rIdx8b_ca3gmdlp6t7edraai">
+      <w:hyperlink w:history="1" r:id="rIdrkt8tosx43aigtewk29cc">
         <w:r>
           <w:rPr>
             <w:rFonts w:ascii="Calibri" w:cs="Calibri" w:eastAsia="Calibri" w:hAnsi="Calibri"/>
@@ -1544,7 +1544,7 @@
       <w:pPr>
         <w:spacing w:after="100"/>
       </w:pPr>
-      <w:hyperlink w:history="1" r:id="rIdmtksnybg9bsawogrppcmm">
+      <w:hyperlink w:history="1" r:id="rIdekzt2-5tcstffj2nawymd">
         <w:r>
           <w:rPr>
             <w:rFonts w:ascii="Calibri" w:cs="Calibri" w:eastAsia="Calibri" w:hAnsi="Calibri"/>
@@ -1724,7 +1724,7 @@
       <w:pPr>
         <w:spacing w:after="100"/>
       </w:pPr>
-      <w:hyperlink w:history="1" r:id="rIdnwkfj93jgldy_vbdjsnsv">
+      <w:hyperlink w:history="1" r:id="rIdkuby2fcgbeydisaiaqz7q">
         <w:r>
           <w:rPr>
             <w:rFonts w:ascii="Calibri" w:cs="Calibri" w:eastAsia="Calibri" w:hAnsi="Calibri"/>
@@ -1741,7 +1741,7 @@
       <w:pPr>
         <w:spacing w:after="100"/>
       </w:pPr>
-      <w:hyperlink w:history="1" r:id="rIdsuqzvtsplu-gfbn0l87ff">
+      <w:hyperlink w:history="1" r:id="rIdurum12x1frwuoa4jbbm9x">
         <w:r>
           <w:rPr>
             <w:rFonts w:ascii="Calibri" w:cs="Calibri" w:eastAsia="Calibri" w:hAnsi="Calibri"/>
@@ -1964,7 +1964,7 @@
       <w:pPr>
         <w:spacing w:after="100"/>
       </w:pPr>
-      <w:hyperlink w:history="1" r:id="rIdx-kw9x-lq1jzm-wk5ic03">
+      <w:hyperlink w:history="1" r:id="rId5v6ugtn4whcyfp_fvzaud">
         <w:r>
           <w:rPr>
             <w:rFonts w:ascii="Calibri" w:cs="Calibri" w:eastAsia="Calibri" w:hAnsi="Calibri"/>
@@ -2199,7 +2199,7 @@
       <w:pPr>
         <w:spacing w:after="100"/>
       </w:pPr>
-      <w:hyperlink w:history="1" r:id="rIds8gbyswqy5ndmy9qz5m6o">
+      <w:hyperlink w:history="1" r:id="rIdjhinri5a70zerv3l_5gii">
         <w:r>
           <w:rPr>
             <w:rFonts w:ascii="Calibri" w:cs="Calibri" w:eastAsia="Calibri" w:hAnsi="Calibri"/>
@@ -2216,7 +2216,7 @@
       <w:pPr>
         <w:spacing w:after="100"/>
       </w:pPr>
-      <w:hyperlink w:history="1" r:id="rIdfscpzoif_iettldp_bjpc">
+      <w:hyperlink w:history="1" r:id="rIdzmifoprz4pnkqgipw6zmg">
         <w:r>
           <w:rPr>
             <w:rFonts w:ascii="Calibri" w:cs="Calibri" w:eastAsia="Calibri" w:hAnsi="Calibri"/>
@@ -2319,7 +2319,7 @@
       <w:pPr>
         <w:spacing w:after="100"/>
       </w:pPr>
-      <w:hyperlink w:history="1" r:id="rIdhebc8bqeznoxswgriopli">
+      <w:hyperlink w:history="1" r:id="rIdlbhpglnkzadwatgikmyq0">
         <w:r>
           <w:rPr>
             <w:rFonts w:ascii="Calibri" w:cs="Calibri" w:eastAsia="Calibri" w:hAnsi="Calibri"/>
@@ -2355,7 +2355,7 @@
       <w:pPr>
         <w:spacing w:after="100"/>
       </w:pPr>
-      <w:hyperlink w:history="1" r:id="rIddxlddfpgp2xpxqu4jcfos">
+      <w:hyperlink w:history="1" r:id="rIdrniynvfzp13he-pqwgpd_">
         <w:r>
           <w:rPr>
             <w:rFonts w:ascii="Calibri" w:cs="Calibri" w:eastAsia="Calibri" w:hAnsi="Calibri"/>
@@ -2435,7 +2435,7 @@
       <w:pPr>
         <w:spacing w:after="100"/>
       </w:pPr>
-      <w:hyperlink w:history="1" r:id="rIdi1ecrji2mzufsf44xpxo-">
+      <w:hyperlink w:history="1" r:id="rIdo2prlhjh4wqi3aws04-b_">
         <w:r>
           <w:rPr>
             <w:rFonts w:ascii="Calibri" w:cs="Calibri" w:eastAsia="Calibri" w:hAnsi="Calibri"/>
@@ -2620,7 +2620,7 @@
       <w:pPr>
         <w:spacing w:after="100"/>
       </w:pPr>
-      <w:hyperlink w:history="1" r:id="rIdiessp2ixp4wv71g3t_xwx">
+      <w:hyperlink w:history="1" r:id="rIdbrtow8wlcatxtn_s9zeq5">
         <w:r>
           <w:rPr>
             <w:rFonts w:ascii="Calibri" w:cs="Calibri" w:eastAsia="Calibri" w:hAnsi="Calibri"/>
@@ -2637,7 +2637,7 @@
       <w:pPr>
         <w:spacing w:after="100"/>
       </w:pPr>
-      <w:hyperlink w:history="1" r:id="rIdp-xzt3w6r7korn_umokwo">
+      <w:hyperlink w:history="1" r:id="rIdvbz2ephhraw67zu9_bolf">
         <w:r>
           <w:rPr>
             <w:rFonts w:ascii="Calibri" w:cs="Calibri" w:eastAsia="Calibri" w:hAnsi="Calibri"/>
@@ -2906,7 +2906,7 @@
       <w:pPr>
         <w:spacing w:after="100"/>
       </w:pPr>
-      <w:hyperlink w:history="1" r:id="rIdl2hz_0zwnuariy9x7uvkl">
+      <w:hyperlink w:history="1" r:id="rIdzd6zav5ev8c7ez1g_nyr3">
         <w:r>
           <w:rPr>
             <w:rFonts w:ascii="Calibri" w:cs="Calibri" w:eastAsia="Calibri" w:hAnsi="Calibri"/>
@@ -2923,7 +2923,7 @@
       <w:pPr>
         <w:spacing w:after="100"/>
       </w:pPr>
-      <w:hyperlink w:history="1" r:id="rIdukpzpchnmqefqeya_sit8">
+      <w:hyperlink w:history="1" r:id="rIdmb6a0qvwjmr9npecmna1-">
         <w:r>
           <w:rPr>
             <w:rFonts w:ascii="Calibri" w:cs="Calibri" w:eastAsia="Calibri" w:hAnsi="Calibri"/>
@@ -3204,7 +3204,7 @@
       <w:pPr>
         <w:spacing w:after="100"/>
       </w:pPr>
-      <w:hyperlink w:history="1" r:id="rIdlh_lsha4vjbhagfd7zcr9">
+      <w:hyperlink w:history="1" r:id="rIdpces6hrne9cbf1pmwzh0c">
         <w:r>
           <w:rPr>
             <w:rFonts w:ascii="Calibri" w:cs="Calibri" w:eastAsia="Calibri" w:hAnsi="Calibri"/>
@@ -3221,7 +3221,7 @@
       <w:pPr>
         <w:spacing w:after="100"/>
       </w:pPr>
-      <w:hyperlink w:history="1" r:id="rIdslymtqwx2c39zcrxo_ftj">
+      <w:hyperlink w:history="1" r:id="rIdp5w1phyiah41fnftwnvoz">
         <w:r>
           <w:rPr>
             <w:rFonts w:ascii="Calibri" w:cs="Calibri" w:eastAsia="Calibri" w:hAnsi="Calibri"/>
@@ -3387,7 +3387,7 @@
       <w:pPr>
         <w:spacing w:after="100"/>
       </w:pPr>
-      <w:hyperlink w:history="1" r:id="rIdb7q87pgjgq6j2s7eltpnn">
+      <w:hyperlink w:history="1" r:id="rIdwwar4jssykys67wqqzxb6">
         <w:r>
           <w:rPr>
             <w:rFonts w:ascii="Calibri" w:cs="Calibri" w:eastAsia="Calibri" w:hAnsi="Calibri"/>
@@ -3572,7 +3572,7 @@
       <w:pPr>
         <w:spacing w:after="100"/>
       </w:pPr>
-      <w:hyperlink w:history="1" r:id="rId6ysrcnjbxjxc4c7cwc_yz">
+      <w:hyperlink w:history="1" r:id="rIdldjl9aqlim-rnwticpi-5">
         <w:r>
           <w:rPr>
             <w:rFonts w:ascii="Calibri" w:cs="Calibri" w:eastAsia="Calibri" w:hAnsi="Calibri"/>
@@ -3627,7 +3627,7 @@
         </w:rPr>
         <w:t xml:space="preserve">Empresa de Acueducto y Alcantarillado de Bogotá E.S.P. (EAAB-ESP). (2026). Misión, visión, funciones y deberes institucionales. Recuperado el 23 de agosto de 2026, de </w:t>
       </w:r>
-      <w:hyperlink w:history="1" r:id="rId6a7pdtswd8iizbf_dyuef">
+      <w:hyperlink w:history="1" r:id="rIdbdsm5lgkhfxiytmpk4ooc">
         <w:r>
           <w:rPr>
             <w:rFonts w:ascii="Calibri" w:cs="Calibri" w:eastAsia="Calibri" w:hAnsi="Calibri"/>
@@ -3682,7 +3682,7 @@
         </w:rPr>
         <w:t xml:space="preserve">Empresa de Acueducto y Alcantarillado de Bogotá E.S.P. (EAAB-ESP). (2026). Portal de Transparencia y Acceso a la Información Pública (Ley 1712 de 2014). Recuperado el 23 de agosto de 2026, de </w:t>
       </w:r>
-      <w:hyperlink w:history="1" r:id="rIdngchfrnisxuejrouwbj18">
+      <w:hyperlink w:history="1" r:id="rIdzxvobta5u5_ixrj2rudut">
         <w:r>
           <w:rPr>
             <w:rFonts w:ascii="Calibri" w:cs="Calibri" w:eastAsia="Calibri" w:hAnsi="Calibri"/>
@@ -3737,7 +3737,7 @@
         </w:rPr>
         <w:t xml:space="preserve">Empresa de Acueducto y Alcantarillado de Bogotá E.S.P. (EAAB-ESP). (2026). Organigrama general de la entidad (Actualizado a 18 de agosto de 2026). Recuperado el 23 de agosto de 2026, de </w:t>
       </w:r>
-      <w:hyperlink w:history="1" r:id="rIdosp80omg-od3kc3rxinya">
+      <w:hyperlink w:history="1" r:id="rId0jb2jjepmbkxyvjlli7ks">
         <w:r>
           <w:rPr>
             <w:rFonts w:ascii="Calibri" w:cs="Calibri" w:eastAsia="Calibri" w:hAnsi="Calibri"/>
@@ -3792,7 +3792,7 @@
         </w:rPr>
         <w:t xml:space="preserve">Empresa de Acueducto y Alcantarillado de Bogotá E.S.P. (EAAB-ESP). (2026). Visión y misión empresarial. Recuperado el 23 de agosto de 2026, de </w:t>
       </w:r>
-      <w:hyperlink w:history="1" r:id="rIdu_ltygebtuwqyllu2dejm">
+      <w:hyperlink w:history="1" r:id="rIdjq4addb8zevquxeptwueg">
         <w:r>
           <w:rPr>
             <w:rFonts w:ascii="Calibri" w:cs="Calibri" w:eastAsia="Calibri" w:hAnsi="Calibri"/>
@@ -3847,7 +3847,7 @@
         </w:rPr>
         <w:t xml:space="preserve">Empresa de Acueducto y Alcantarillado de Bogotá E.S.P. (EAAB-ESP). (2026). Estructura orgánica y funciones. Recuperado el 23 de agosto de 2026, de </w:t>
       </w:r>
-      <w:hyperlink w:history="1" r:id="rIdx3zlqmhqyhbwuvdfxybfq">
+      <w:hyperlink w:history="1" r:id="rIdshf1fakorgi-v9qejrbxk">
         <w:r>
           <w:rPr>
             <w:rFonts w:ascii="Calibri" w:cs="Calibri" w:eastAsia="Calibri" w:hAnsi="Calibri"/>
@@ -3902,7 +3902,7 @@
         </w:rPr>
         <w:t xml:space="preserve">Empresa de Acueducto y Alcantarillado de Bogotá E.S.P. (EAAB-ESP). (2026). Responsabilidad social empresarial y gestión ambiental. Recuperado el 23 de agosto de 2026, de </w:t>
       </w:r>
-      <w:hyperlink w:history="1" r:id="rIdot7okss-lfkibnzrzoaon">
+      <w:hyperlink w:history="1" r:id="rIdydo24ylsyary5-c7vy9qq">
         <w:r>
           <w:rPr>
             <w:rFonts w:ascii="Calibri" w:cs="Calibri" w:eastAsia="Calibri" w:hAnsi="Calibri"/>
@@ -3957,7 +3957,7 @@
         </w:rPr>
         <w:t xml:space="preserve">Departamento Administrativo de la Función Pública. (2014). Ley 1712 de 2014 — Ley de Transparencia y del Derecho de Acceso a la Información Pública Nacional. Recuperado el 23 de agosto de 2026, de </w:t>
       </w:r>
-      <w:hyperlink w:history="1" r:id="rId3oipvaiwc99i2fjrfgf1h">
+      <w:hyperlink w:history="1" r:id="rIdjuetpvzueettwm2i869hb">
         <w:r>
           <w:rPr>
             <w:rFonts w:ascii="Calibri" w:cs="Calibri" w:eastAsia="Calibri" w:hAnsi="Calibri"/>
@@ -4012,7 +4012,7 @@
         </w:rPr>
         <w:t xml:space="preserve">Departamento Administrativo de la Función Pública. (1994). Ley 142 de 1994 — Régimen de los Servicios Públicos Domiciliarios. Recuperado el 23 de agosto de 2026, de </w:t>
       </w:r>
-      <w:hyperlink w:history="1" r:id="rIdtlvxymvkh8zvioxqwadmk">
+      <w:hyperlink w:history="1" r:id="rIdrizkvnljr_ahtl6mtnkc_">
         <w:r>
           <w:rPr>
             <w:rFonts w:ascii="Calibri" w:cs="Calibri" w:eastAsia="Calibri" w:hAnsi="Calibri"/>
@@ -4067,7 +4067,7 @@
         </w:rPr>
         <w:t xml:space="preserve">Empresa de Acueducto y Alcantarillado de Bogotá E.S.P. (EAAB-ESP). (2026). Términos, condiciones y datos corporativos. Recuperado el 23 de agosto de 2026, de </w:t>
       </w:r>
-      <w:hyperlink w:history="1" r:id="rIdmqcycrbzr09qugw8hyf5j">
+      <w:hyperlink w:history="1" r:id="rIdllc7bedjczoxwa5glut3d">
         <w:r>
           <w:rPr>
             <w:rFonts w:ascii="Calibri" w:cs="Calibri" w:eastAsia="Calibri" w:hAnsi="Calibri"/>
@@ -4122,7 +4122,7 @@
         </w:rPr>
         <w:t xml:space="preserve">Empresa de Acueducto y Alcantarillado de Bogotá E.S.P. (EAAB-ESP). (2026). Planeación, presupuesto e informes financieros. Recuperado el 23 de agosto de 2026, de </w:t>
       </w:r>
-      <w:hyperlink w:history="1" r:id="rId8qm9q-wmtd6r-p7asstaw">
+      <w:hyperlink w:history="1" r:id="rIdwllokgn_qh71izyze47wq">
         <w:r>
           <w:rPr>
             <w:rFonts w:ascii="Calibri" w:cs="Calibri" w:eastAsia="Calibri" w:hAnsi="Calibri"/>
@@ -4177,7 +4177,7 @@
         </w:rPr>
         <w:t xml:space="preserve">Empresa de Acueducto y Alcantarillado de Bogotá E.S.P. (EAAB-ESP). (2026). Caracterización y diálogo con grupos de interés. Recuperado el 23 de agosto de 2026, de </w:t>
       </w:r>
-      <w:hyperlink w:history="1" r:id="rIdsyvhkvzy4heljce45uohv">
+      <w:hyperlink w:history="1" r:id="rIdfj53tt1smfsejygj7ayps">
         <w:r>
           <w:rPr>
             <w:rFonts w:ascii="Calibri" w:cs="Calibri" w:eastAsia="Calibri" w:hAnsi="Calibri"/>
@@ -4232,7 +4232,7 @@
         </w:rPr>
         <w:t xml:space="preserve">Empresa de Acueducto y Alcantarillado de Bogotá E.S.P. (EAAB-ESP). (2026). Mapas y cartas descriptivas de los procesos institucionales. Recuperado el 23 de agosto de 2026, de </w:t>
       </w:r>
-      <w:hyperlink w:history="1" r:id="rIdgj9fnnhvdrayuror5c36z">
+      <w:hyperlink w:history="1" r:id="rIdklcvb0jyajihngh3fymel">
         <w:r>
           <w:rPr>
             <w:rFonts w:ascii="Calibri" w:cs="Calibri" w:eastAsia="Calibri" w:hAnsi="Calibri"/>

</xml_diff>